<commit_message>
Link selection: strict synonyms, direct web-module links, live verification
Tracker page rejects non-/kiwix/ targets, so web modules are linked directly.
51 strict-equivalent synonym groups; title-level foreign-vocab rule; weaker
subject-tag penalty (index tags unreliable). All 85 re-rendered; gate clean;
1,707/1,707 links verified live on demo.aresedu.dev.

Co-Authored-By: Claude Opus 5.5 (1M context) <noreply@anthropic.com>
</commit_message>
<xml_diff>
--- a/data/outputs/v2/Biology/SS1.3_Cell_Biology/Biology_Cell_Biology_CBE_LessonSequence.docx
+++ b/data/outputs/v2/Biology/SS1.3_Cell_Biology/Biology_Cell_Biology_CBE_LessonSequence.docx
@@ -3265,7 +3265,7 @@
             <w:pPr>
               <w:spacing w:after="20" w:before="0"/>
             </w:pPr>
-            <w:hyperlink w:history="1" r:id="rIdz1f-txosoi4dccbgcz6n0">
+            <w:hyperlink w:history="1" r:id="rId3vmypk9k2flzvdecvzlv-">
               <w:r>
                 <w:rPr>
                   <w:rFonts w:ascii="Arial" w:cs="Arial" w:eastAsia="Arial" w:hAnsi="Arial"/>
@@ -3298,7 +3298,7 @@
               <w:spacing w:after="10" w:before="0"/>
               <w:ind w:left="120"/>
             </w:pPr>
-            <w:hyperlink w:history="1" r:id="rIdqfslfg9rf8lwkeqne10wm">
+            <w:hyperlink w:history="1" r:id="rIdpqvbhjqr9khulgi67shmi">
               <w:r>
                 <w:rPr>
                   <w:rFonts w:ascii="Arial" w:cs="Arial" w:eastAsia="Arial" w:hAnsi="Arial"/>
@@ -3343,7 +3343,7 @@
             <w:pPr>
               <w:spacing w:after="20" w:before="0"/>
             </w:pPr>
-            <w:hyperlink w:history="1" r:id="rIdkl3k8r0mfvkrbr2upci-o">
+            <w:hyperlink w:history="1" r:id="rIdyscxbcamleunwqdjgvobp">
               <w:r>
                 <w:rPr>
                   <w:rFonts w:ascii="Arial" w:cs="Arial" w:eastAsia="Arial" w:hAnsi="Arial"/>
@@ -3376,7 +3376,7 @@
               <w:spacing w:after="10" w:before="0"/>
               <w:ind w:left="120"/>
             </w:pPr>
-            <w:hyperlink w:history="1" r:id="rIdrnb5mtjyov2tdeujutx6f">
+            <w:hyperlink w:history="1" r:id="rId3pbnuhoiebk5zusynr8zf">
               <w:r>
                 <w:rPr>
                   <w:rFonts w:ascii="Arial" w:cs="Arial" w:eastAsia="Arial" w:hAnsi="Arial"/>
@@ -3571,7 +3571,7 @@
             <w:pPr>
               <w:spacing w:after="20" w:before="0"/>
             </w:pPr>
-            <w:hyperlink w:history="1" r:id="rId6tjdts4rjxwovmnjsmpvx">
+            <w:hyperlink w:history="1" r:id="rIdkjucqgyuiyawdfaazdgtw">
               <w:r>
                 <w:rPr>
                   <w:rFonts w:ascii="Arial" w:cs="Arial" w:eastAsia="Arial" w:hAnsi="Arial"/>
@@ -3604,7 +3604,7 @@
               <w:spacing w:after="10" w:before="0"/>
               <w:ind w:left="120"/>
             </w:pPr>
-            <w:hyperlink w:history="1" r:id="rId7rdsjiam-_1vpxeaiapns">
+            <w:hyperlink w:history="1" r:id="rIdph1us7uwv2g5x6zpzf0gh">
               <w:r>
                 <w:rPr>
                   <w:rFonts w:ascii="Arial" w:cs="Arial" w:eastAsia="Arial" w:hAnsi="Arial"/>
@@ -3649,7 +3649,7 @@
             <w:pPr>
               <w:spacing w:after="20" w:before="0"/>
             </w:pPr>
-            <w:hyperlink w:history="1" r:id="rIdmfngnxtqe68rhwwaonzhw">
+            <w:hyperlink w:history="1" r:id="rIdzyty6uvmasdb3z-l4_g3g">
               <w:r>
                 <w:rPr>
                   <w:rFonts w:ascii="Arial" w:cs="Arial" w:eastAsia="Arial" w:hAnsi="Arial"/>
@@ -3682,7 +3682,7 @@
               <w:spacing w:after="10" w:before="0"/>
               <w:ind w:left="120"/>
             </w:pPr>
-            <w:hyperlink w:history="1" r:id="rIdtr3pdlaiym49jntuiizwm">
+            <w:hyperlink w:history="1" r:id="rIdyjis2mem_trrs6fkedekg">
               <w:r>
                 <w:rPr>
                   <w:rFonts w:ascii="Arial" w:cs="Arial" w:eastAsia="Arial" w:hAnsi="Arial"/>
@@ -3877,7 +3877,7 @@
             <w:pPr>
               <w:spacing w:after="20" w:before="0"/>
             </w:pPr>
-            <w:hyperlink w:history="1" r:id="rIdtiivsvgl1udpdoycsi2qj">
+            <w:hyperlink w:history="1" r:id="rIduitooyx4o5vln-wfvk-nq">
               <w:r>
                 <w:rPr>
                   <w:rFonts w:ascii="Arial" w:cs="Arial" w:eastAsia="Arial" w:hAnsi="Arial"/>
@@ -3910,7 +3910,7 @@
               <w:spacing w:after="10" w:before="0"/>
               <w:ind w:left="120"/>
             </w:pPr>
-            <w:hyperlink w:history="1" r:id="rIdwhz-h1wdj1dmldqiy0e6x">
+            <w:hyperlink w:history="1" r:id="rIdzfxspgg-1nn4xdsxbairq">
               <w:r>
                 <w:rPr>
                   <w:rFonts w:ascii="Arial" w:cs="Arial" w:eastAsia="Arial" w:hAnsi="Arial"/>
@@ -3955,7 +3955,7 @@
             <w:pPr>
               <w:spacing w:after="20" w:before="0"/>
             </w:pPr>
-            <w:hyperlink w:history="1" r:id="rIddssp5su18ngimbbfvfxfe">
+            <w:hyperlink w:history="1" r:id="rIdmaqttpvoazd25_lbdj9gq">
               <w:r>
                 <w:rPr>
                   <w:rFonts w:ascii="Arial" w:cs="Arial" w:eastAsia="Arial" w:hAnsi="Arial"/>
@@ -3988,7 +3988,7 @@
               <w:spacing w:after="10" w:before="0"/>
               <w:ind w:left="120"/>
             </w:pPr>
-            <w:hyperlink w:history="1" r:id="rIdfjv_9bhpdisvy9-pkmjbf">
+            <w:hyperlink w:history="1" r:id="rIdn-npnps6mwe8zse4tvxrh">
               <w:r>
                 <w:rPr>
                   <w:rFonts w:ascii="Arial" w:cs="Arial" w:eastAsia="Arial" w:hAnsi="Arial"/>
@@ -4183,7 +4183,7 @@
             <w:pPr>
               <w:spacing w:after="20" w:before="0"/>
             </w:pPr>
-            <w:hyperlink w:history="1" r:id="rIdgjzv7pvygglhlxolrj0cl">
+            <w:hyperlink w:history="1" r:id="rIdzb52acb94vtrcc67etddq">
               <w:r>
                 <w:rPr>
                   <w:rFonts w:ascii="Arial" w:cs="Arial" w:eastAsia="Arial" w:hAnsi="Arial"/>
@@ -4216,7 +4216,7 @@
               <w:spacing w:after="10" w:before="0"/>
               <w:ind w:left="120"/>
             </w:pPr>
-            <w:hyperlink w:history="1" r:id="rIdlazv_2v3nejjcuozn8-6a">
+            <w:hyperlink w:history="1" r:id="rIdfrqsnerixgrfe0yb3bstk">
               <w:r>
                 <w:rPr>
                   <w:rFonts w:ascii="Arial" w:cs="Arial" w:eastAsia="Arial" w:hAnsi="Arial"/>
@@ -4261,7 +4261,7 @@
             <w:pPr>
               <w:spacing w:after="20" w:before="0"/>
             </w:pPr>
-            <w:hyperlink w:history="1" r:id="rIdyemwakzszpeygb8ioczlc">
+            <w:hyperlink w:history="1" r:id="rId6n0moguuu5ziqv3akwsu0">
               <w:r>
                 <w:rPr>
                   <w:rFonts w:ascii="Arial" w:cs="Arial" w:eastAsia="Arial" w:hAnsi="Arial"/>
@@ -4294,7 +4294,7 @@
               <w:spacing w:after="10" w:before="0"/>
               <w:ind w:left="120"/>
             </w:pPr>
-            <w:hyperlink w:history="1" r:id="rIdggpgh6rjziyectrfz7f_r">
+            <w:hyperlink w:history="1" r:id="rId2iktwsqsbvhpmxkhpvukq">
               <w:r>
                 <w:rPr>
                   <w:rFonts w:ascii="Arial" w:cs="Arial" w:eastAsia="Arial" w:hAnsi="Arial"/>
@@ -4489,7 +4489,7 @@
             <w:pPr>
               <w:spacing w:after="20" w:before="0"/>
             </w:pPr>
-            <w:hyperlink w:history="1" r:id="rIdtt2rwxbm4cc1f9ikghdja">
+            <w:hyperlink w:history="1" r:id="rIdvfotidm4cbfl-k-xypwo1">
               <w:r>
                 <w:rPr>
                   <w:rFonts w:ascii="Arial" w:cs="Arial" w:eastAsia="Arial" w:hAnsi="Arial"/>
@@ -4522,7 +4522,7 @@
               <w:spacing w:after="10" w:before="0"/>
               <w:ind w:left="120"/>
             </w:pPr>
-            <w:hyperlink w:history="1" r:id="rId9g1u28mnexdlkawjvptre">
+            <w:hyperlink w:history="1" r:id="rId0i4zadzsg-ovqmmfuaecp">
               <w:r>
                 <w:rPr>
                   <w:rFonts w:ascii="Arial" w:cs="Arial" w:eastAsia="Arial" w:hAnsi="Arial"/>
@@ -4567,7 +4567,7 @@
             <w:pPr>
               <w:spacing w:after="20" w:before="0"/>
             </w:pPr>
-            <w:hyperlink w:history="1" r:id="rIdzajdsxxxwbfjsq8i9spfr">
+            <w:hyperlink w:history="1" r:id="rIdnim2gylyftf7_wtypqhem">
               <w:r>
                 <w:rPr>
                   <w:rFonts w:ascii="Arial" w:cs="Arial" w:eastAsia="Arial" w:hAnsi="Arial"/>
@@ -4600,7 +4600,7 @@
               <w:spacing w:after="10" w:before="0"/>
               <w:ind w:left="120"/>
             </w:pPr>
-            <w:hyperlink w:history="1" r:id="rIdpl2o5s3qi5zgmhkqfrvsa">
+            <w:hyperlink w:history="1" r:id="rIdjfl9zvnwhjhupzrm-voag">
               <w:r>
                 <w:rPr>
                   <w:rFonts w:ascii="Arial" w:cs="Arial" w:eastAsia="Arial" w:hAnsi="Arial"/>
@@ -6201,7 +6201,7 @@
             <w:pPr>
               <w:spacing w:after="20" w:before="0"/>
             </w:pPr>
-            <w:hyperlink w:history="1" r:id="rIdscassp9sln1f4vtxdj8ah">
+            <w:hyperlink w:history="1" r:id="rIdkaoorvlsanisyygrhesab">
               <w:r>
                 <w:rPr>
                   <w:rFonts w:ascii="Arial" w:cs="Arial" w:eastAsia="Arial" w:hAnsi="Arial"/>
@@ -6234,7 +6234,7 @@
               <w:spacing w:after="10" w:before="0"/>
               <w:ind w:left="120"/>
             </w:pPr>
-            <w:hyperlink w:history="1" r:id="rId9fmr0ld7jsr4vbmpeqago">
+            <w:hyperlink w:history="1" r:id="rIdzfyazuc1ht7sowbio8tbj">
               <w:r>
                 <w:rPr>
                   <w:rFonts w:ascii="Arial" w:cs="Arial" w:eastAsia="Arial" w:hAnsi="Arial"/>
@@ -6279,7 +6279,7 @@
             <w:pPr>
               <w:spacing w:after="20" w:before="0"/>
             </w:pPr>
-            <w:hyperlink w:history="1" r:id="rId6-dkx9sbaxiijuj95v251">
+            <w:hyperlink w:history="1" r:id="rIdwucxxwsshyiebdcv2sf0i">
               <w:r>
                 <w:rPr>
                   <w:rFonts w:ascii="Arial" w:cs="Arial" w:eastAsia="Arial" w:hAnsi="Arial"/>
@@ -6312,7 +6312,7 @@
               <w:spacing w:after="10" w:before="0"/>
               <w:ind w:left="120"/>
             </w:pPr>
-            <w:hyperlink w:history="1" r:id="rId94dvzhtbeouzd2sn0ho0c">
+            <w:hyperlink w:history="1" r:id="rIdcpue08ctvxmh5kkbuld3c">
               <w:r>
                 <w:rPr>
                   <w:rFonts w:ascii="Arial" w:cs="Arial" w:eastAsia="Arial" w:hAnsi="Arial"/>
@@ -6507,7 +6507,7 @@
             <w:pPr>
               <w:spacing w:after="20" w:before="0"/>
             </w:pPr>
-            <w:hyperlink w:history="1" r:id="rIdrfukcuoz3e5pozr4pdmeb">
+            <w:hyperlink w:history="1" r:id="rId7ky4td1gsih-vefjewd9p">
               <w:r>
                 <w:rPr>
                   <w:rFonts w:ascii="Arial" w:cs="Arial" w:eastAsia="Arial" w:hAnsi="Arial"/>
@@ -6540,7 +6540,7 @@
               <w:spacing w:after="10" w:before="0"/>
               <w:ind w:left="120"/>
             </w:pPr>
-            <w:hyperlink w:history="1" r:id="rId28iu2jun44qipyxh0nws0">
+            <w:hyperlink w:history="1" r:id="rIdbdq4x2iad_vfih4qxi8nq">
               <w:r>
                 <w:rPr>
                   <w:rFonts w:ascii="Arial" w:cs="Arial" w:eastAsia="Arial" w:hAnsi="Arial"/>
@@ -6585,7 +6585,7 @@
             <w:pPr>
               <w:spacing w:after="20" w:before="0"/>
             </w:pPr>
-            <w:hyperlink w:history="1" r:id="rIdaz8t9odai-5xzc6q7489x">
+            <w:hyperlink w:history="1" r:id="rIdl9d3aougbqatxumtwzo_h">
               <w:r>
                 <w:rPr>
                   <w:rFonts w:ascii="Arial" w:cs="Arial" w:eastAsia="Arial" w:hAnsi="Arial"/>
@@ -6618,7 +6618,7 @@
               <w:spacing w:after="10" w:before="0"/>
               <w:ind w:left="120"/>
             </w:pPr>
-            <w:hyperlink w:history="1" r:id="rIdbau6kqlahyiyqfiaep1py">
+            <w:hyperlink w:history="1" r:id="rIdnhj-ubqqhcseymtxlego0">
               <w:r>
                 <w:rPr>
                   <w:rFonts w:ascii="Arial" w:cs="Arial" w:eastAsia="Arial" w:hAnsi="Arial"/>
@@ -6813,7 +6813,7 @@
             <w:pPr>
               <w:spacing w:after="20" w:before="0"/>
             </w:pPr>
-            <w:hyperlink w:history="1" r:id="rIdzaf5ehorh_pzklmc1xze7">
+            <w:hyperlink w:history="1" r:id="rIdbhjfo8ilsct2rte6syaxq">
               <w:r>
                 <w:rPr>
                   <w:rFonts w:ascii="Arial" w:cs="Arial" w:eastAsia="Arial" w:hAnsi="Arial"/>
@@ -6846,7 +6846,7 @@
               <w:spacing w:after="10" w:before="0"/>
               <w:ind w:left="120"/>
             </w:pPr>
-            <w:hyperlink w:history="1" r:id="rIdd5uhmwgztmmi49nzt5lrt">
+            <w:hyperlink w:history="1" r:id="rIdygfya9ww2pm4vumdww93_">
               <w:r>
                 <w:rPr>
                   <w:rFonts w:ascii="Arial" w:cs="Arial" w:eastAsia="Arial" w:hAnsi="Arial"/>
@@ -6891,7 +6891,7 @@
             <w:pPr>
               <w:spacing w:after="20" w:before="0"/>
             </w:pPr>
-            <w:hyperlink w:history="1" r:id="rIdbgtccotpbbsnpy08sscq_">
+            <w:hyperlink w:history="1" r:id="rId15thnv-xoencm5qaijnnn">
               <w:r>
                 <w:rPr>
                   <w:rFonts w:ascii="Arial" w:cs="Arial" w:eastAsia="Arial" w:hAnsi="Arial"/>
@@ -6924,7 +6924,7 @@
               <w:spacing w:after="10" w:before="0"/>
               <w:ind w:left="120"/>
             </w:pPr>
-            <w:hyperlink w:history="1" r:id="rIdw-zxglcnptshgomywqdwj">
+            <w:hyperlink w:history="1" r:id="rIdjwxdbshjcghlua-55cpqx">
               <w:r>
                 <w:rPr>
                   <w:rFonts w:ascii="Arial" w:cs="Arial" w:eastAsia="Arial" w:hAnsi="Arial"/>
@@ -7119,7 +7119,7 @@
             <w:pPr>
               <w:spacing w:after="20" w:before="0"/>
             </w:pPr>
-            <w:hyperlink w:history="1" r:id="rIdve2zxfi9g8vdzpiznx6yt">
+            <w:hyperlink w:history="1" r:id="rIdid3ets3z-xshbufhstryg">
               <w:r>
                 <w:rPr>
                   <w:rFonts w:ascii="Arial" w:cs="Arial" w:eastAsia="Arial" w:hAnsi="Arial"/>
@@ -7152,7 +7152,7 @@
               <w:spacing w:after="10" w:before="0"/>
               <w:ind w:left="120"/>
             </w:pPr>
-            <w:hyperlink w:history="1" r:id="rId6imiwgoln3ladlgrm41wd">
+            <w:hyperlink w:history="1" r:id="rIdavyas0ktwbojseyzxj5hw">
               <w:r>
                 <w:rPr>
                   <w:rFonts w:ascii="Arial" w:cs="Arial" w:eastAsia="Arial" w:hAnsi="Arial"/>
@@ -7197,7 +7197,7 @@
             <w:pPr>
               <w:spacing w:after="20" w:before="0"/>
             </w:pPr>
-            <w:hyperlink w:history="1" r:id="rIdxx1l_pqjeibxbwuedpdse">
+            <w:hyperlink w:history="1" r:id="rIdlc8dpr3amiej_zllx2qgm">
               <w:r>
                 <w:rPr>
                   <w:rFonts w:ascii="Arial" w:cs="Arial" w:eastAsia="Arial" w:hAnsi="Arial"/>
@@ -7230,7 +7230,7 @@
               <w:spacing w:after="10" w:before="0"/>
               <w:ind w:left="120"/>
             </w:pPr>
-            <w:hyperlink w:history="1" r:id="rIdeprggt4zhin4gvsxtvkz0">
+            <w:hyperlink w:history="1" r:id="rIdvrsulnogyntoqfzxqono4">
               <w:r>
                 <w:rPr>
                   <w:rFonts w:ascii="Arial" w:cs="Arial" w:eastAsia="Arial" w:hAnsi="Arial"/>
@@ -7425,7 +7425,7 @@
             <w:pPr>
               <w:spacing w:after="20" w:before="0"/>
             </w:pPr>
-            <w:hyperlink w:history="1" r:id="rIdvi7ngk1d8a1bzksau0sf9">
+            <w:hyperlink w:history="1" r:id="rIdm-mgw9_tsjfs80j92_eer">
               <w:r>
                 <w:rPr>
                   <w:rFonts w:ascii="Arial" w:cs="Arial" w:eastAsia="Arial" w:hAnsi="Arial"/>
@@ -7458,7 +7458,7 @@
               <w:spacing w:after="10" w:before="0"/>
               <w:ind w:left="120"/>
             </w:pPr>
-            <w:hyperlink w:history="1" r:id="rIdcumk_zxtiy0eczkhyjk7w">
+            <w:hyperlink w:history="1" r:id="rIdxeawkspttv6qtysld_vsj">
               <w:r>
                 <w:rPr>
                   <w:rFonts w:ascii="Arial" w:cs="Arial" w:eastAsia="Arial" w:hAnsi="Arial"/>
@@ -7503,7 +7503,7 @@
             <w:pPr>
               <w:spacing w:after="20" w:before="0"/>
             </w:pPr>
-            <w:hyperlink w:history="1" r:id="rId08ffnff_myzzjqgnh7yt3">
+            <w:hyperlink w:history="1" r:id="rIdmsdlvbutz28npd0x6hwpx">
               <w:r>
                 <w:rPr>
                   <w:rFonts w:ascii="Arial" w:cs="Arial" w:eastAsia="Arial" w:hAnsi="Arial"/>
@@ -7536,7 +7536,7 @@
               <w:spacing w:after="10" w:before="0"/>
               <w:ind w:left="120"/>
             </w:pPr>
-            <w:hyperlink w:history="1" r:id="rIdfoe1hzaxcbe7g5qer81x9">
+            <w:hyperlink w:history="1" r:id="rIdmjxfd67--hh24qwszsyiw">
               <w:r>
                 <w:rPr>
                   <w:rFonts w:ascii="Arial" w:cs="Arial" w:eastAsia="Arial" w:hAnsi="Arial"/>
@@ -9023,7 +9023,7 @@
             <w:pPr>
               <w:spacing w:after="20" w:before="0"/>
             </w:pPr>
-            <w:hyperlink w:history="1" r:id="rIdm31xoudwd1ea5dreej1gf">
+            <w:hyperlink w:history="1" r:id="rIdbnnnv8ewldgbk_s5yz7vk">
               <w:r>
                 <w:rPr>
                   <w:rFonts w:ascii="Arial" w:cs="Arial" w:eastAsia="Arial" w:hAnsi="Arial"/>
@@ -9056,7 +9056,7 @@
               <w:spacing w:after="10" w:before="0"/>
               <w:ind w:left="120"/>
             </w:pPr>
-            <w:hyperlink w:history="1" r:id="rId8geswfo3nuda8aa94mqf8">
+            <w:hyperlink w:history="1" r:id="rIdf33ivdrytoaro7lr0unzb">
               <w:r>
                 <w:rPr>
                   <w:rFonts w:ascii="Arial" w:cs="Arial" w:eastAsia="Arial" w:hAnsi="Arial"/>
@@ -9101,7 +9101,7 @@
             <w:pPr>
               <w:spacing w:after="20" w:before="0"/>
             </w:pPr>
-            <w:hyperlink w:history="1" r:id="rId-xbchst9jj4r46nkkntpf">
+            <w:hyperlink w:history="1" r:id="rIdrgbzotq_zq3hzskoheej6">
               <w:r>
                 <w:rPr>
                   <w:rFonts w:ascii="Arial" w:cs="Arial" w:eastAsia="Arial" w:hAnsi="Arial"/>
@@ -9134,7 +9134,7 @@
               <w:spacing w:after="10" w:before="0"/>
               <w:ind w:left="120"/>
             </w:pPr>
-            <w:hyperlink w:history="1" r:id="rIdjaq0_k86l7w_okvzyrlxl">
+            <w:hyperlink w:history="1" r:id="rIdhxi_m-kmezelmykeyd6lv">
               <w:r>
                 <w:rPr>
                   <w:rFonts w:ascii="Arial" w:cs="Arial" w:eastAsia="Arial" w:hAnsi="Arial"/>
@@ -9405,7 +9405,7 @@
             <w:pPr>
               <w:spacing w:after="20" w:before="0"/>
             </w:pPr>
-            <w:hyperlink w:history="1" r:id="rIdsiq7o9zri92f7xnxqaztd">
+            <w:hyperlink w:history="1" r:id="rIdabgq2f6nirlwyybpwy5f6">
               <w:r>
                 <w:rPr>
                   <w:rFonts w:ascii="Arial" w:cs="Arial" w:eastAsia="Arial" w:hAnsi="Arial"/>
@@ -9438,7 +9438,7 @@
               <w:spacing w:after="10" w:before="0"/>
               <w:ind w:left="120"/>
             </w:pPr>
-            <w:hyperlink w:history="1" r:id="rIddtovfrmpvpw0qiuzekh_w">
+            <w:hyperlink w:history="1" r:id="rIdggbfrpx4cmbuotoeqiuw_">
               <w:r>
                 <w:rPr>
                   <w:rFonts w:ascii="Arial" w:cs="Arial" w:eastAsia="Arial" w:hAnsi="Arial"/>
@@ -9483,7 +9483,7 @@
             <w:pPr>
               <w:spacing w:after="20" w:before="0"/>
             </w:pPr>
-            <w:hyperlink w:history="1" r:id="rIdjw9r_boqlje_fy4l0mvjp">
+            <w:hyperlink w:history="1" r:id="rIdurirzynst9jqlesnc10ew">
               <w:r>
                 <w:rPr>
                   <w:rFonts w:ascii="Arial" w:cs="Arial" w:eastAsia="Arial" w:hAnsi="Arial"/>
@@ -9516,7 +9516,7 @@
               <w:spacing w:after="10" w:before="0"/>
               <w:ind w:left="120"/>
             </w:pPr>
-            <w:hyperlink w:history="1" r:id="rIdnnqlk3nikl5ov5egmrdp9">
+            <w:hyperlink w:history="1" r:id="rIdwajxburdlsadnjopcfxy2">
               <w:r>
                 <w:rPr>
                   <w:rFonts w:ascii="Arial" w:cs="Arial" w:eastAsia="Arial" w:hAnsi="Arial"/>
@@ -9787,7 +9787,7 @@
             <w:pPr>
               <w:spacing w:after="20" w:before="0"/>
             </w:pPr>
-            <w:hyperlink w:history="1" r:id="rIdgchfglz0rkinx5nwwa7tv">
+            <w:hyperlink w:history="1" r:id="rId8icrljxa3fthfc5f-gdj4">
               <w:r>
                 <w:rPr>
                   <w:rFonts w:ascii="Arial" w:cs="Arial" w:eastAsia="Arial" w:hAnsi="Arial"/>
@@ -9820,7 +9820,7 @@
               <w:spacing w:after="10" w:before="0"/>
               <w:ind w:left="120"/>
             </w:pPr>
-            <w:hyperlink w:history="1" r:id="rIdc8q5jaqu36gq47uz_t7nv">
+            <w:hyperlink w:history="1" r:id="rIdzqh_2vle48xumvno9cnzz">
               <w:r>
                 <w:rPr>
                   <w:rFonts w:ascii="Arial" w:cs="Arial" w:eastAsia="Arial" w:hAnsi="Arial"/>
@@ -9865,7 +9865,7 @@
             <w:pPr>
               <w:spacing w:after="20" w:before="0"/>
             </w:pPr>
-            <w:hyperlink w:history="1" r:id="rIdxbxhtj_3siezgutfru6fn">
+            <w:hyperlink w:history="1" r:id="rIdrftzwosl0o2t3pdqts-b_">
               <w:r>
                 <w:rPr>
                   <w:rFonts w:ascii="Arial" w:cs="Arial" w:eastAsia="Arial" w:hAnsi="Arial"/>
@@ -9898,7 +9898,7 @@
               <w:spacing w:after="10" w:before="0"/>
               <w:ind w:left="120"/>
             </w:pPr>
-            <w:hyperlink w:history="1" r:id="rIdd08ovkg6w0qttmqhzlrpv">
+            <w:hyperlink w:history="1" r:id="rIdubusikr0njsljosvtinir">
               <w:r>
                 <w:rPr>
                   <w:rFonts w:ascii="Arial" w:cs="Arial" w:eastAsia="Arial" w:hAnsi="Arial"/>
@@ -10169,7 +10169,7 @@
             <w:pPr>
               <w:spacing w:after="20" w:before="0"/>
             </w:pPr>
-            <w:hyperlink w:history="1" r:id="rId_yk4cvx52dsmspn4ndrmx">
+            <w:hyperlink w:history="1" r:id="rIdohy4ycq8j8ioljskco8_j">
               <w:r>
                 <w:rPr>
                   <w:rFonts w:ascii="Arial" w:cs="Arial" w:eastAsia="Arial" w:hAnsi="Arial"/>
@@ -10202,7 +10202,7 @@
               <w:spacing w:after="10" w:before="0"/>
               <w:ind w:left="120"/>
             </w:pPr>
-            <w:hyperlink w:history="1" r:id="rIdnfl7yho7y0rxe1dwdb3cy">
+            <w:hyperlink w:history="1" r:id="rIdjphqq0ribrdfofpwq_5q4">
               <w:r>
                 <w:rPr>
                   <w:rFonts w:ascii="Arial" w:cs="Arial" w:eastAsia="Arial" w:hAnsi="Arial"/>
@@ -10247,7 +10247,7 @@
             <w:pPr>
               <w:spacing w:after="20" w:before="0"/>
             </w:pPr>
-            <w:hyperlink w:history="1" r:id="rId-jp-tztpxr9icevpzhmkg">
+            <w:hyperlink w:history="1" r:id="rIdvqrbyxoxif2f1gs2dbvpf">
               <w:r>
                 <w:rPr>
                   <w:rFonts w:ascii="Arial" w:cs="Arial" w:eastAsia="Arial" w:hAnsi="Arial"/>
@@ -10280,7 +10280,7 @@
               <w:spacing w:after="10" w:before="0"/>
               <w:ind w:left="120"/>
             </w:pPr>
-            <w:hyperlink w:history="1" r:id="rIdanayw8bqmw9t9w-4y1edg">
+            <w:hyperlink w:history="1" r:id="rIdkfzumuc-4zkzh9egp--ck">
               <w:r>
                 <w:rPr>
                   <w:rFonts w:ascii="Arial" w:cs="Arial" w:eastAsia="Arial" w:hAnsi="Arial"/>
@@ -10551,7 +10551,7 @@
             <w:pPr>
               <w:spacing w:after="20" w:before="0"/>
             </w:pPr>
-            <w:hyperlink w:history="1" r:id="rIdvjoxgs2uh0dflkyktd-bk">
+            <w:hyperlink w:history="1" r:id="rIdjyld4dxjbeczlzdc1suv8">
               <w:r>
                 <w:rPr>
                   <w:rFonts w:ascii="Arial" w:cs="Arial" w:eastAsia="Arial" w:hAnsi="Arial"/>
@@ -10584,7 +10584,7 @@
               <w:spacing w:after="10" w:before="0"/>
               <w:ind w:left="120"/>
             </w:pPr>
-            <w:hyperlink w:history="1" r:id="rIdfhdx04jjtbvrfnc-vdkbo">
+            <w:hyperlink w:history="1" r:id="rIdv68hhngtakm78syjns2db">
               <w:r>
                 <w:rPr>
                   <w:rFonts w:ascii="Arial" w:cs="Arial" w:eastAsia="Arial" w:hAnsi="Arial"/>
@@ -10629,7 +10629,7 @@
             <w:pPr>
               <w:spacing w:after="20" w:before="0"/>
             </w:pPr>
-            <w:hyperlink w:history="1" r:id="rIdp5_-uizc6icdbnttgvcd8">
+            <w:hyperlink w:history="1" r:id="rIdgn_o2y5_wjfxrmeo4thgo">
               <w:r>
                 <w:rPr>
                   <w:rFonts w:ascii="Arial" w:cs="Arial" w:eastAsia="Arial" w:hAnsi="Arial"/>
@@ -10662,7 +10662,7 @@
               <w:spacing w:after="10" w:before="0"/>
               <w:ind w:left="120"/>
             </w:pPr>
-            <w:hyperlink w:history="1" r:id="rId_fmccnccegerqggjnrbaj">
+            <w:hyperlink w:history="1" r:id="rIdokgmfwi96t97zdn-fupo7">
               <w:r>
                 <w:rPr>
                   <w:rFonts w:ascii="Arial" w:cs="Arial" w:eastAsia="Arial" w:hAnsi="Arial"/>
@@ -12225,7 +12225,7 @@
             <w:pPr>
               <w:spacing w:after="20" w:before="0"/>
             </w:pPr>
-            <w:hyperlink w:history="1" r:id="rIdoe1piojyqaxkcrldaqe7x">
+            <w:hyperlink w:history="1" r:id="rIdtglxndraydt8l1y3zbphz">
               <w:r>
                 <w:rPr>
                   <w:rFonts w:ascii="Arial" w:cs="Arial" w:eastAsia="Arial" w:hAnsi="Arial"/>
@@ -12258,7 +12258,7 @@
               <w:spacing w:after="10" w:before="0"/>
               <w:ind w:left="120"/>
             </w:pPr>
-            <w:hyperlink w:history="1" r:id="rIdqd0nneccvneppxh_7jqjf">
+            <w:hyperlink w:history="1" r:id="rIdptnbxmcw0-dboihjktp6f">
               <w:r>
                 <w:rPr>
                   <w:rFonts w:ascii="Arial" w:cs="Arial" w:eastAsia="Arial" w:hAnsi="Arial"/>
@@ -12303,7 +12303,7 @@
             <w:pPr>
               <w:spacing w:after="20" w:before="0"/>
             </w:pPr>
-            <w:hyperlink w:history="1" r:id="rIdj4evel5xhccf4bwttvz8q">
+            <w:hyperlink w:history="1" r:id="rIdzqtpyz94rkjgx3xnm_4ht">
               <w:r>
                 <w:rPr>
                   <w:rFonts w:ascii="Arial" w:cs="Arial" w:eastAsia="Arial" w:hAnsi="Arial"/>
@@ -12336,7 +12336,7 @@
               <w:spacing w:after="10" w:before="0"/>
               <w:ind w:left="120"/>
             </w:pPr>
-            <w:hyperlink w:history="1" r:id="rIdubl7gd6txr8rjwmskwvkj">
+            <w:hyperlink w:history="1" r:id="rIdeq8-msyelrzte7153wej8">
               <w:r>
                 <w:rPr>
                   <w:rFonts w:ascii="Arial" w:cs="Arial" w:eastAsia="Arial" w:hAnsi="Arial"/>
@@ -12531,7 +12531,7 @@
             <w:pPr>
               <w:spacing w:after="20" w:before="0"/>
             </w:pPr>
-            <w:hyperlink w:history="1" r:id="rIdhaceh3bkq3zsdo29lfiqu">
+            <w:hyperlink w:history="1" r:id="rIdpkooio6uhgmnbiz5wvzgc">
               <w:r>
                 <w:rPr>
                   <w:rFonts w:ascii="Arial" w:cs="Arial" w:eastAsia="Arial" w:hAnsi="Arial"/>
@@ -12564,7 +12564,7 @@
               <w:spacing w:after="10" w:before="0"/>
               <w:ind w:left="120"/>
             </w:pPr>
-            <w:hyperlink w:history="1" r:id="rIdrttnnkbkibfwygmnbx24e">
+            <w:hyperlink w:history="1" r:id="rIdjkj3x6kn7fvg-skc5mng-">
               <w:r>
                 <w:rPr>
                   <w:rFonts w:ascii="Arial" w:cs="Arial" w:eastAsia="Arial" w:hAnsi="Arial"/>
@@ -12609,7 +12609,7 @@
             <w:pPr>
               <w:spacing w:after="20" w:before="0"/>
             </w:pPr>
-            <w:hyperlink w:history="1" r:id="rId9psdtk30nmqwg7rhzam03">
+            <w:hyperlink w:history="1" r:id="rIdrkxobxxj0-5kxiuasw6ir">
               <w:r>
                 <w:rPr>
                   <w:rFonts w:ascii="Arial" w:cs="Arial" w:eastAsia="Arial" w:hAnsi="Arial"/>
@@ -12642,7 +12642,7 @@
               <w:spacing w:after="10" w:before="0"/>
               <w:ind w:left="120"/>
             </w:pPr>
-            <w:hyperlink w:history="1" r:id="rIdqortady7ewn_ffjvl2v9v">
+            <w:hyperlink w:history="1" r:id="rIdyenxbwymcjsmavkkr9qfz">
               <w:r>
                 <w:rPr>
                   <w:rFonts w:ascii="Arial" w:cs="Arial" w:eastAsia="Arial" w:hAnsi="Arial"/>
@@ -12837,7 +12837,7 @@
             <w:pPr>
               <w:spacing w:after="20" w:before="0"/>
             </w:pPr>
-            <w:hyperlink w:history="1" r:id="rIdowzx4jgl7odzwows78otj">
+            <w:hyperlink w:history="1" r:id="rIdbbtwm0in-wrin1zf5i_fc">
               <w:r>
                 <w:rPr>
                   <w:rFonts w:ascii="Arial" w:cs="Arial" w:eastAsia="Arial" w:hAnsi="Arial"/>
@@ -12870,7 +12870,7 @@
               <w:spacing w:after="10" w:before="0"/>
               <w:ind w:left="120"/>
             </w:pPr>
-            <w:hyperlink w:history="1" r:id="rIdu0cfyhaspwk-mspvc8fpc">
+            <w:hyperlink w:history="1" r:id="rIdefliqlgo8no2o0yjihaqw">
               <w:r>
                 <w:rPr>
                   <w:rFonts w:ascii="Arial" w:cs="Arial" w:eastAsia="Arial" w:hAnsi="Arial"/>
@@ -12915,7 +12915,7 @@
             <w:pPr>
               <w:spacing w:after="20" w:before="0"/>
             </w:pPr>
-            <w:hyperlink w:history="1" r:id="rIdwsbl8zqfauu0qqnkldjda">
+            <w:hyperlink w:history="1" r:id="rIdzkcjcvkhtco2wqdsksj5_">
               <w:r>
                 <w:rPr>
                   <w:rFonts w:ascii="Arial" w:cs="Arial" w:eastAsia="Arial" w:hAnsi="Arial"/>
@@ -12948,7 +12948,7 @@
               <w:spacing w:after="10" w:before="0"/>
               <w:ind w:left="120"/>
             </w:pPr>
-            <w:hyperlink w:history="1" r:id="rId0abkfisqnkrwpcvkkl_nr">
+            <w:hyperlink w:history="1" r:id="rId5vecx6vuupw3_6sbcupgi">
               <w:r>
                 <w:rPr>
                   <w:rFonts w:ascii="Arial" w:cs="Arial" w:eastAsia="Arial" w:hAnsi="Arial"/>
@@ -13143,7 +13143,7 @@
             <w:pPr>
               <w:spacing w:after="20" w:before="0"/>
             </w:pPr>
-            <w:hyperlink w:history="1" r:id="rIdvnezinz5gc4bajgebrxoj">
+            <w:hyperlink w:history="1" r:id="rIdxgfyeqaazclcnvibcydbk">
               <w:r>
                 <w:rPr>
                   <w:rFonts w:ascii="Arial" w:cs="Arial" w:eastAsia="Arial" w:hAnsi="Arial"/>
@@ -13176,7 +13176,7 @@
               <w:spacing w:after="10" w:before="0"/>
               <w:ind w:left="120"/>
             </w:pPr>
-            <w:hyperlink w:history="1" r:id="rIda_ef9olazosz0j3ssdgp5">
+            <w:hyperlink w:history="1" r:id="rIdpxqcnphdlaltostc-fnlw">
               <w:r>
                 <w:rPr>
                   <w:rFonts w:ascii="Arial" w:cs="Arial" w:eastAsia="Arial" w:hAnsi="Arial"/>
@@ -13221,7 +13221,7 @@
             <w:pPr>
               <w:spacing w:after="20" w:before="0"/>
             </w:pPr>
-            <w:hyperlink w:history="1" r:id="rIdcsz5xjohjplzqz3mz_2gs">
+            <w:hyperlink w:history="1" r:id="rIdcb4nzzcdbn-sn5dafuzss">
               <w:r>
                 <w:rPr>
                   <w:rFonts w:ascii="Arial" w:cs="Arial" w:eastAsia="Arial" w:hAnsi="Arial"/>
@@ -13254,7 +13254,7 @@
               <w:spacing w:after="10" w:before="0"/>
               <w:ind w:left="120"/>
             </w:pPr>
-            <w:hyperlink w:history="1" r:id="rIdj87qnz2iiexz9joq7dzyv">
+            <w:hyperlink w:history="1" r:id="rIdjhjsr2fohahmlhtcncsny">
               <w:r>
                 <w:rPr>
                   <w:rFonts w:ascii="Arial" w:cs="Arial" w:eastAsia="Arial" w:hAnsi="Arial"/>
@@ -13449,7 +13449,7 @@
             <w:pPr>
               <w:spacing w:after="20" w:before="0"/>
             </w:pPr>
-            <w:hyperlink w:history="1" r:id="rId39pblyfer2km4hqwnqkut">
+            <w:hyperlink w:history="1" r:id="rIdd1gjvzj1pkuw9cvcw_wi4">
               <w:r>
                 <w:rPr>
                   <w:rFonts w:ascii="Arial" w:cs="Arial" w:eastAsia="Arial" w:hAnsi="Arial"/>
@@ -13482,7 +13482,7 @@
               <w:spacing w:after="10" w:before="0"/>
               <w:ind w:left="120"/>
             </w:pPr>
-            <w:hyperlink w:history="1" r:id="rId8aewz3v0nm7xk1dyreppm">
+            <w:hyperlink w:history="1" r:id="rIdebr-1isocpgk0mdahv4an">
               <w:r>
                 <w:rPr>
                   <w:rFonts w:ascii="Arial" w:cs="Arial" w:eastAsia="Arial" w:hAnsi="Arial"/>
@@ -13527,7 +13527,7 @@
             <w:pPr>
               <w:spacing w:after="20" w:before="0"/>
             </w:pPr>
-            <w:hyperlink w:history="1" r:id="rId4scvdlt4naoskljyqgnb-">
+            <w:hyperlink w:history="1" r:id="rIdxtnghhqn_34pf7o61n0qf">
               <w:r>
                 <w:rPr>
                   <w:rFonts w:ascii="Arial" w:cs="Arial" w:eastAsia="Arial" w:hAnsi="Arial"/>
@@ -13560,7 +13560,7 @@
               <w:spacing w:after="10" w:before="0"/>
               <w:ind w:left="120"/>
             </w:pPr>
-            <w:hyperlink w:history="1" r:id="rIdxzckb6ppktgzebuqyblp2">
+            <w:hyperlink w:history="1" r:id="rId7co_g_9h3a05f6stgyu0u">
               <w:r>
                 <w:rPr>
                   <w:rFonts w:ascii="Arial" w:cs="Arial" w:eastAsia="Arial" w:hAnsi="Arial"/>
@@ -15047,7 +15047,7 @@
             <w:pPr>
               <w:spacing w:after="20" w:before="0"/>
             </w:pPr>
-            <w:hyperlink w:history="1" r:id="rIdd3wpcrv76di5nocjxosdw">
+            <w:hyperlink w:history="1" r:id="rIdcnwnenlu1igmlzierhpbl">
               <w:r>
                 <w:rPr>
                   <w:rFonts w:ascii="Arial" w:cs="Arial" w:eastAsia="Arial" w:hAnsi="Arial"/>
@@ -15080,7 +15080,7 @@
               <w:spacing w:after="10" w:before="0"/>
               <w:ind w:left="120"/>
             </w:pPr>
-            <w:hyperlink w:history="1" r:id="rIdyt48c31keo_j3_l5hcg5t">
+            <w:hyperlink w:history="1" r:id="rIdptxpkpqgscuym2pb4sikv">
               <w:r>
                 <w:rPr>
                   <w:rFonts w:ascii="Arial" w:cs="Arial" w:eastAsia="Arial" w:hAnsi="Arial"/>
@@ -15125,7 +15125,7 @@
             <w:pPr>
               <w:spacing w:after="20" w:before="0"/>
             </w:pPr>
-            <w:hyperlink w:history="1" r:id="rId_qhy9dvwolhm-bjb1lkxg">
+            <w:hyperlink w:history="1" r:id="rId32s5rjm0zjslrqye2vip-">
               <w:r>
                 <w:rPr>
                   <w:rFonts w:ascii="Arial" w:cs="Arial" w:eastAsia="Arial" w:hAnsi="Arial"/>
@@ -15158,7 +15158,7 @@
               <w:spacing w:after="10" w:before="0"/>
               <w:ind w:left="120"/>
             </w:pPr>
-            <w:hyperlink w:history="1" r:id="rIdq-qsp1oe334fxcf_k_5sp">
+            <w:hyperlink w:history="1" r:id="rIdvrxncjsil9nktxx_eq1po">
               <w:r>
                 <w:rPr>
                   <w:rFonts w:ascii="Arial" w:cs="Arial" w:eastAsia="Arial" w:hAnsi="Arial"/>
@@ -15353,7 +15353,7 @@
             <w:pPr>
               <w:spacing w:after="20" w:before="0"/>
             </w:pPr>
-            <w:hyperlink w:history="1" r:id="rIdwosl38u_qmae8pezqt9ma">
+            <w:hyperlink w:history="1" r:id="rIdrgcpp-oqd3sc5sgqurfce">
               <w:r>
                 <w:rPr>
                   <w:rFonts w:ascii="Arial" w:cs="Arial" w:eastAsia="Arial" w:hAnsi="Arial"/>
@@ -15386,7 +15386,7 @@
               <w:spacing w:after="10" w:before="0"/>
               <w:ind w:left="120"/>
             </w:pPr>
-            <w:hyperlink w:history="1" r:id="rIdimwbgvlzpdutvc6rksdj8">
+            <w:hyperlink w:history="1" r:id="rIdj1om9rlkt0wotbqqeixf7">
               <w:r>
                 <w:rPr>
                   <w:rFonts w:ascii="Arial" w:cs="Arial" w:eastAsia="Arial" w:hAnsi="Arial"/>
@@ -15431,7 +15431,7 @@
             <w:pPr>
               <w:spacing w:after="20" w:before="0"/>
             </w:pPr>
-            <w:hyperlink w:history="1" r:id="rIdjxednseoybn85vgmt3grq">
+            <w:hyperlink w:history="1" r:id="rIddvwkvsf0efogrdermwbd7">
               <w:r>
                 <w:rPr>
                   <w:rFonts w:ascii="Arial" w:cs="Arial" w:eastAsia="Arial" w:hAnsi="Arial"/>
@@ -15464,7 +15464,7 @@
               <w:spacing w:after="10" w:before="0"/>
               <w:ind w:left="120"/>
             </w:pPr>
-            <w:hyperlink w:history="1" r:id="rIdcfkve1bgf4dnr1itbjr5v">
+            <w:hyperlink w:history="1" r:id="rId3s_dequ43a7yqdfl5gkef">
               <w:r>
                 <w:rPr>
                   <w:rFonts w:ascii="Arial" w:cs="Arial" w:eastAsia="Arial" w:hAnsi="Arial"/>
@@ -15659,7 +15659,7 @@
             <w:pPr>
               <w:spacing w:after="20" w:before="0"/>
             </w:pPr>
-            <w:hyperlink w:history="1" r:id="rIdgomvxu12knaxlboihmp3u">
+            <w:hyperlink w:history="1" r:id="rIdqa8uvd3xyugc0jlnn-ptf">
               <w:r>
                 <w:rPr>
                   <w:rFonts w:ascii="Arial" w:cs="Arial" w:eastAsia="Arial" w:hAnsi="Arial"/>
@@ -15692,7 +15692,7 @@
               <w:spacing w:after="10" w:before="0"/>
               <w:ind w:left="120"/>
             </w:pPr>
-            <w:hyperlink w:history="1" r:id="rIdzqqrizqx7jxyn9urseiom">
+            <w:hyperlink w:history="1" r:id="rIdkgyafkjpmrxiqwgf4bwsw">
               <w:r>
                 <w:rPr>
                   <w:rFonts w:ascii="Arial" w:cs="Arial" w:eastAsia="Arial" w:hAnsi="Arial"/>
@@ -15737,7 +15737,7 @@
             <w:pPr>
               <w:spacing w:after="20" w:before="0"/>
             </w:pPr>
-            <w:hyperlink w:history="1" r:id="rIdnaiwx4piwyay3ueevgwh3">
+            <w:hyperlink w:history="1" r:id="rId8btrwa0mwqxd0wivl7tn5">
               <w:r>
                 <w:rPr>
                   <w:rFonts w:ascii="Arial" w:cs="Arial" w:eastAsia="Arial" w:hAnsi="Arial"/>
@@ -15770,7 +15770,7 @@
               <w:spacing w:after="10" w:before="0"/>
               <w:ind w:left="120"/>
             </w:pPr>
-            <w:hyperlink w:history="1" r:id="rIdubzeq17dijuzxoew7lr-1">
+            <w:hyperlink w:history="1" r:id="rIdvwsiqxl-tywbx-xfvxqio">
               <w:r>
                 <w:rPr>
                   <w:rFonts w:ascii="Arial" w:cs="Arial" w:eastAsia="Arial" w:hAnsi="Arial"/>
@@ -15965,7 +15965,7 @@
             <w:pPr>
               <w:spacing w:after="20" w:before="0"/>
             </w:pPr>
-            <w:hyperlink w:history="1" r:id="rIdgpm3t3cvulu6kvzt0nzmf">
+            <w:hyperlink w:history="1" r:id="rIduzpj6jsbru5xceqslzba0">
               <w:r>
                 <w:rPr>
                   <w:rFonts w:ascii="Arial" w:cs="Arial" w:eastAsia="Arial" w:hAnsi="Arial"/>
@@ -15998,7 +15998,7 @@
               <w:spacing w:after="10" w:before="0"/>
               <w:ind w:left="120"/>
             </w:pPr>
-            <w:hyperlink w:history="1" r:id="rIdgcnvf2kynx5fa947a3ruy">
+            <w:hyperlink w:history="1" r:id="rIdquuedzjxhmltiqbkt91qf">
               <w:r>
                 <w:rPr>
                   <w:rFonts w:ascii="Arial" w:cs="Arial" w:eastAsia="Arial" w:hAnsi="Arial"/>
@@ -16043,7 +16043,7 @@
             <w:pPr>
               <w:spacing w:after="20" w:before="0"/>
             </w:pPr>
-            <w:hyperlink w:history="1" r:id="rIdlrvpca0tg6ijnqrgkdgcd">
+            <w:hyperlink w:history="1" r:id="rIdxlsscqsrsuh21jfqymxii">
               <w:r>
                 <w:rPr>
                   <w:rFonts w:ascii="Arial" w:cs="Arial" w:eastAsia="Arial" w:hAnsi="Arial"/>
@@ -16076,7 +16076,7 @@
               <w:spacing w:after="10" w:before="0"/>
               <w:ind w:left="120"/>
             </w:pPr>
-            <w:hyperlink w:history="1" r:id="rIdtwhss334avgov7sl7ranx">
+            <w:hyperlink w:history="1" r:id="rId9pozylu8v1a2lnmqkewa8">
               <w:r>
                 <w:rPr>
                   <w:rFonts w:ascii="Arial" w:cs="Arial" w:eastAsia="Arial" w:hAnsi="Arial"/>
@@ -16271,7 +16271,7 @@
             <w:pPr>
               <w:spacing w:after="20" w:before="0"/>
             </w:pPr>
-            <w:hyperlink w:history="1" r:id="rIdilwxibsqh_5wxig7dvqx3">
+            <w:hyperlink w:history="1" r:id="rIdn5hmnygkiunpv-epbospw">
               <w:r>
                 <w:rPr>
                   <w:rFonts w:ascii="Arial" w:cs="Arial" w:eastAsia="Arial" w:hAnsi="Arial"/>
@@ -16304,7 +16304,7 @@
               <w:spacing w:after="10" w:before="0"/>
               <w:ind w:left="120"/>
             </w:pPr>
-            <w:hyperlink w:history="1" r:id="rId8sgttgdxl2dpr_pborant">
+            <w:hyperlink w:history="1" r:id="rIdjkci6jbrwvp3t9cbyqm_c">
               <w:r>
                 <w:rPr>
                   <w:rFonts w:ascii="Arial" w:cs="Arial" w:eastAsia="Arial" w:hAnsi="Arial"/>
@@ -16349,7 +16349,7 @@
             <w:pPr>
               <w:spacing w:after="20" w:before="0"/>
             </w:pPr>
-            <w:hyperlink w:history="1" r:id="rId79ipc4nghewa-divykzfr">
+            <w:hyperlink w:history="1" r:id="rIdjryukmc-myy6mgez0vidq">
               <w:r>
                 <w:rPr>
                   <w:rFonts w:ascii="Arial" w:cs="Arial" w:eastAsia="Arial" w:hAnsi="Arial"/>
@@ -16382,7 +16382,7 @@
               <w:spacing w:after="10" w:before="0"/>
               <w:ind w:left="120"/>
             </w:pPr>
-            <w:hyperlink w:history="1" r:id="rIdfbfrozjcvi_9pot4k4inp">
+            <w:hyperlink w:history="1" r:id="rIdco_ugq3gezgd_ymwdphqw">
               <w:r>
                 <w:rPr>
                   <w:rFonts w:ascii="Arial" w:cs="Arial" w:eastAsia="Arial" w:hAnsi="Arial"/>
@@ -17869,7 +17869,312 @@
             <w:pPr>
               <w:spacing w:after="20" w:before="0"/>
             </w:pPr>
-            <w:hyperlink w:history="1" r:id="rIdjacwahzeebquidfw3zun1">
+            <w:hyperlink w:history="1" r:id="rIdjwtrutnhdqkxn635lzyy9">
+              <w:r>
+                <w:rPr>
+                  <w:rFonts w:ascii="Arial" w:cs="Arial" w:eastAsia="Arial" w:hAnsi="Arial"/>
+                  <w:color w:val="2E75B6"/>
+                  <w:sz w:val="16"/>
+                  <w:szCs w:val="16"/>
+                  <w:u w:val="single" w:color="2E75B6"/>
+                </w:rPr>
+                <w:t xml:space="preserve">Red blood cells</w:t>
+              </w:r>
+            </w:hyperlink>
+          </w:p>
+          <w:p>
+            <w:pPr>
+              <w:spacing w:after="10" w:before="0"/>
+              <w:ind w:left="120"/>
+            </w:pPr>
+            <w:r>
+              <w:rPr>
+                <w:rFonts w:ascii="Arial" w:cs="Arial" w:eastAsia="Arial" w:hAnsi="Arial"/>
+                <w:color w:val="595959"/>
+                <w:sz w:val="14"/>
+                <w:szCs w:val="14"/>
+              </w:rPr>
+              <w:t xml:space="preserve">Source: Khan Academy (English - US curriculum)</w:t>
+            </w:r>
+          </w:p>
+          <w:p>
+            <w:pPr>
+              <w:spacing w:after="10" w:before="0"/>
+              <w:ind w:left="120"/>
+            </w:pPr>
+            <w:hyperlink w:history="1" r:id="rIdw_xgbrepmeulhyqlmt8d2">
+              <w:r>
+                <w:rPr>
+                  <w:rFonts w:ascii="Arial" w:cs="Arial" w:eastAsia="Arial" w:hAnsi="Arial"/>
+                  <w:color w:val="595959"/>
+                  <w:sz w:val="14"/>
+                  <w:szCs w:val="14"/>
+                  <w:u w:val="single" w:color="595959"/>
+                </w:rPr>
+                <w:t xml:space="preserve">🔍 Search ARES for similar videos</w:t>
+              </w:r>
+            </w:hyperlink>
+          </w:p>
+          <w:p>
+            <w:pPr>
+              <w:spacing w:after="40" w:before="0"/>
+            </w:pPr>
+            <w:r>
+              <w:rPr>
+                <w:sz w:val="14"/>
+                <w:szCs w:val="14"/>
+              </w:rPr>
+              <w:t xml:space="preserve"/>
+            </w:r>
+          </w:p>
+          <w:p>
+            <w:pPr>
+              <w:spacing w:after="20" w:before="0"/>
+            </w:pPr>
+            <w:r>
+              <w:rPr>
+                <w:rFonts w:ascii="Arial" w:cs="Arial" w:eastAsia="Arial" w:hAnsi="Arial"/>
+                <w:b/>
+                <w:bCs/>
+                <w:color w:val="1F3864"/>
+                <w:sz w:val="16"/>
+                <w:szCs w:val="16"/>
+              </w:rPr>
+              <w:t xml:space="preserve">📖 READING:</w:t>
+            </w:r>
+          </w:p>
+          <w:p>
+            <w:pPr>
+              <w:spacing w:after="20" w:before="0"/>
+            </w:pPr>
+            <w:r>
+              <w:rPr>
+                <w:rFonts w:ascii="Arial" w:cs="Arial" w:eastAsia="Arial" w:hAnsi="Arial"/>
+                <w:i/>
+                <w:iCs/>
+                <w:color w:val="595959"/>
+                <w:sz w:val="16"/>
+                <w:szCs w:val="16"/>
+              </w:rPr>
+              <w:t xml:space="preserve">No closely matching reading in the ARES library for this activity.</w:t>
+            </w:r>
+          </w:p>
+          <w:p>
+            <w:pPr>
+              <w:spacing w:after="10" w:before="0"/>
+              <w:ind w:left="120"/>
+            </w:pPr>
+            <w:hyperlink w:history="1" r:id="rIdxk0ay-cohkawd5e7xd_ge">
+              <w:r>
+                <w:rPr>
+                  <w:rFonts w:ascii="Arial" w:cs="Arial" w:eastAsia="Arial" w:hAnsi="Arial"/>
+                  <w:color w:val="595959"/>
+                  <w:sz w:val="14"/>
+                  <w:szCs w:val="14"/>
+                  <w:u w:val="single" w:color="595959"/>
+                </w:rPr>
+                <w:t xml:space="preserve">🔍 Search ARES for readings</w:t>
+              </w:r>
+            </w:hyperlink>
+          </w:p>
+          <w:p>
+            <w:pPr>
+              <w:spacing w:after="10" w:before="0"/>
+              <w:ind w:left="120"/>
+            </w:pPr>
+            <w:r>
+              <w:rPr>
+                <w:rFonts w:ascii="Arial" w:cs="Arial" w:eastAsia="Arial" w:hAnsi="Arial"/>
+                <w:color w:val="595959"/>
+                <w:sz w:val="14"/>
+                <w:szCs w:val="14"/>
+              </w:rPr>
+              <w:t xml:space="preserve">Search terms: cell biology specialisation red</w:t>
+            </w:r>
+          </w:p>
+        </w:tc>
+        <w:tc>
+          <w:tcPr>
+            <w:tcW w:type="dxa" w:w="3040"/>
+            <w:shd w:fill="FFFFFF" w:color="auto" w:val="clear"/>
+            <w:tcMar>
+              <w:top w:type="dxa" w:w="60"/>
+              <w:left w:type="dxa" w:w="120"/>
+              <w:bottom w:type="dxa" w:w="60"/>
+              <w:right w:type="dxa" w:w="120"/>
+            </w:tcMar>
+            <w:vAlign w:val="top"/>
+          </w:tcPr>
+          <w:p>
+            <w:pPr>
+              <w:spacing w:after="40" w:before="0"/>
+              <w:jc w:val="left"/>
+            </w:pPr>
+            <w:r>
+              <w:rPr>
+                <w:rFonts w:ascii="Arial" w:cs="Arial" w:eastAsia="Arial" w:hAnsi="Arial"/>
+                <w:b w:val="false"/>
+                <w:bCs w:val="false"/>
+                <w:i w:val="false"/>
+                <w:iCs w:val="false"/>
+                <w:color w:val="000000"/>
+                <w:sz w:val="18"/>
+                <w:szCs w:val="18"/>
+              </w:rPr>
+              <w:t xml:space="preserve">Students are shown two side-by-side images on the board: (A) the blood smear from the Kisumu county hospital — showing a biconcave red blood cell and a white blood cell with a large nucleus — and (B) a cross-section of a sukuma wiki leaf cell with a visible chloroplast and central vacuole. Each student independently writes a response to the prompt: 'We have studied the generic cell. These cells are NOT generic. List THREE things that are different about each cell and make a prediction: why might each difference exist?' Students record predictions in their science notebooks. No peer discussion yet — this is individual thinking time.</w:t>
+            </w:r>
+          </w:p>
+        </w:tc>
+        <w:tc>
+          <w:tcPr>
+            <w:tcW w:type="dxa" w:w="3040"/>
+            <w:shd w:fill="F2F2F2" w:color="auto" w:val="clear"/>
+            <w:tcMar>
+              <w:top w:type="dxa" w:w="60"/>
+              <w:left w:type="dxa" w:w="120"/>
+              <w:bottom w:type="dxa" w:w="60"/>
+              <w:right w:type="dxa" w:w="120"/>
+            </w:tcMar>
+            <w:vAlign w:val="top"/>
+          </w:tcPr>
+          <w:p>
+            <w:pPr>
+              <w:spacing w:after="40" w:before="0"/>
+              <w:jc w:val="left"/>
+            </w:pPr>
+            <w:r>
+              <w:rPr>
+                <w:rFonts w:ascii="Arial" w:cs="Arial" w:eastAsia="Arial" w:hAnsi="Arial"/>
+                <w:b w:val="false"/>
+                <w:bCs w:val="false"/>
+                <w:i w:val="false"/>
+                <w:iCs w:val="false"/>
+                <w:color w:val="000000"/>
+                <w:sz w:val="18"/>
+                <w:szCs w:val="18"/>
+              </w:rPr>
+              <w:t xml:space="preserve">Display the two images and read the prompt aloud. Say: 'You have 3 minutes of silent thinking time — no talking, no sharing yet. Write down everything you notice that is DIFFERENT from our generic cell model.' START a visible 3-minute timer. Circulate and observe notebooks — do NOT correct or affirm yet. After 3 minutes, cold-call 4 students (aim for gender balance and at least one student who has been quieter in prior lessons): 'Tell me ONE difference you wrote down — just one.' Record each response verbatim on the board in a column labelled 'Our Predictions.' After all 4 responses, say: 'Hold those predictions — we are going to test every single one of them today using evidence cards. By the end of this lesson you will know whether your prediction was right, partially right, or needs revision.' Do NOT confirm or deny any prediction.</w:t>
+            </w:r>
+          </w:p>
+        </w:tc>
+        <w:tc>
+          <w:tcPr>
+            <w:tcW w:type="dxa" w:w="3040"/>
+            <w:shd w:fill="FFFFFF" w:color="auto" w:val="clear"/>
+            <w:tcMar>
+              <w:top w:type="dxa" w:w="60"/>
+              <w:left w:type="dxa" w:w="120"/>
+              <w:bottom w:type="dxa" w:w="60"/>
+              <w:right w:type="dxa" w:w="120"/>
+            </w:tcMar>
+            <w:vAlign w:val="top"/>
+          </w:tcPr>
+          <w:p>
+            <w:pPr>
+              <w:spacing w:after="40" w:before="0"/>
+              <w:jc w:val="left"/>
+            </w:pPr>
+            <w:r>
+              <w:rPr>
+                <w:rFonts w:ascii="Arial" w:cs="Arial" w:eastAsia="Arial" w:hAnsi="Arial"/>
+                <w:b w:val="false"/>
+                <w:bCs w:val="false"/>
+                <w:i w:val="false"/>
+                <w:iCs w:val="false"/>
+                <w:color w:val="000000"/>
+                <w:sz w:val="18"/>
+                <w:szCs w:val="18"/>
+              </w:rPr>
+              <w:t xml:space="preserve">Individual Prediction Writing — This strategy activates prior knowledge from Lessons 1–5 (generic cell model) and surfaces student misconceptions before instruction. Recording predictions publicly on the board creates accountability and gives students a personal stake in the evidence-gathering that follows.</w:t>
+            </w:r>
+          </w:p>
+        </w:tc>
+        <w:tc>
+          <w:tcPr>
+            <w:tcW w:type="dxa" w:w="3040"/>
+            <w:shd w:fill="F2F2F2" w:color="auto" w:val="clear"/>
+            <w:tcMar>
+              <w:top w:type="dxa" w:w="60"/>
+              <w:left w:type="dxa" w:w="120"/>
+              <w:bottom w:type="dxa" w:w="60"/>
+              <w:right w:type="dxa" w:w="120"/>
+            </w:tcMar>
+            <w:vAlign w:val="top"/>
+          </w:tcPr>
+          <w:p>
+            <w:pPr>
+              <w:spacing w:after="40" w:before="0"/>
+              <w:jc w:val="left"/>
+            </w:pPr>
+            <w:r>
+              <w:rPr>
+                <w:rFonts w:ascii="Arial" w:cs="Arial" w:eastAsia="Arial" w:hAnsi="Arial"/>
+                <w:b w:val="false"/>
+                <w:bCs w:val="false"/>
+                <w:i w:val="false"/>
+                <w:iCs w:val="false"/>
+                <w:color w:val="000000"/>
+                <w:sz w:val="18"/>
+                <w:szCs w:val="18"/>
+              </w:rPr>
+              <w:t xml:space="preserve">Circulate and scan notebooks during the 3-minute silent period. Look for: (a) students who correctly identify absence of nucleus in RBCs, (b) students who notice the chloroplast or vacuole in the leaf cell. Students who write only vague observations ('they look different') will need targeted prompting in Phase 2. Cold-call responses on the board give a quick whole-class snapshot of prior knowledge depth.</w:t>
+            </w:r>
+          </w:p>
+        </w:tc>
+      </w:tr>
+      <w:tr>
+        <w:tc>
+          <w:tcPr>
+            <w:tcW w:type="dxa" w:w="1520"/>
+            <w:shd w:fill="D9EEF1" w:color="auto" w:val="clear"/>
+            <w:tcMar>
+              <w:top w:type="dxa" w:w="60"/>
+              <w:left w:type="dxa" w:w="120"/>
+              <w:bottom w:type="dxa" w:w="60"/>
+              <w:right w:type="dxa" w:w="120"/>
+            </w:tcMar>
+            <w:vAlign w:val="top"/>
+          </w:tcPr>
+          <w:p>
+            <w:pPr>
+              <w:spacing w:after="40" w:before="0"/>
+              <w:jc w:val="left"/>
+            </w:pPr>
+            <w:r>
+              <w:rPr>
+                <w:rFonts w:ascii="Arial" w:cs="Arial" w:eastAsia="Arial" w:hAnsi="Arial"/>
+                <w:b/>
+                <w:bCs/>
+                <w:i w:val="false"/>
+                <w:iCs w:val="false"/>
+                <w:color w:val="000000"/>
+                <w:sz w:val="18"/>
+                <w:szCs w:val="18"/>
+              </w:rPr>
+              <w:t xml:space="preserve">Observe Phase</w:t>
+            </w:r>
+          </w:p>
+          <w:p>
+            <w:pPr>
+              <w:spacing w:after="20" w:before="0"/>
+            </w:pPr>
+            <w:r>
+              <w:rPr>
+                <w:rFonts w:ascii="Arial" w:cs="Arial" w:eastAsia="Arial" w:hAnsi="Arial"/>
+                <w:b/>
+                <w:bCs/>
+                <w:color w:val="1F3864"/>
+                <w:sz w:val="16"/>
+                <w:szCs w:val="16"/>
+              </w:rPr>
+              <w:t xml:space="preserve">📹 VIDEO:</w:t>
+            </w:r>
+          </w:p>
+          <w:p>
+            <w:pPr>
+              <w:spacing w:after="20" w:before="0"/>
+            </w:pPr>
+            <w:hyperlink w:history="1" r:id="rId_vggxh7_7x8-fy1_xzmig">
               <w:r>
                 <w:rPr>
                   <w:rFonts w:ascii="Arial" w:cs="Arial" w:eastAsia="Arial" w:hAnsi="Arial"/>
@@ -17902,7 +18207,7 @@
               <w:spacing w:after="10" w:before="0"/>
               <w:ind w:left="120"/>
             </w:pPr>
-            <w:hyperlink w:history="1" r:id="rIdawhzh6-3xnfqjiklvowwr">
+            <w:hyperlink w:history="1" r:id="rIdggc2j47xuknmbshbktt0j">
               <w:r>
                 <w:rPr>
                   <w:rFonts w:ascii="Arial" w:cs="Arial" w:eastAsia="Arial" w:hAnsi="Arial"/>
@@ -17964,7 +18269,7 @@
               <w:spacing w:after="10" w:before="0"/>
               <w:ind w:left="120"/>
             </w:pPr>
-            <w:hyperlink w:history="1" r:id="rIdyucyfwd7-vrq4xv5ax9xp">
+            <w:hyperlink w:history="1" r:id="rId23hockyaracv_uqq1zdcd">
               <w:r>
                 <w:rPr>
                   <w:rFonts w:ascii="Arial" w:cs="Arial" w:eastAsia="Arial" w:hAnsi="Arial"/>
@@ -18021,7 +18326,7 @@
                 <w:sz w:val="18"/>
                 <w:szCs w:val="18"/>
               </w:rPr>
-              <w:t xml:space="preserve">Students are shown two side-by-side images on the board: (A) the blood smear from the Kisumu county hospital — showing a biconcave red blood cell and a white blood cell with a large nucleus — and (B) a cross-section of a sukuma wiki leaf cell with a visible chloroplast and central vacuole. Each student independently writes a response to the prompt: 'We have studied the generic cell. These cells are NOT generic. List THREE things that are different about each cell and make a prediction: why might each difference exist?' Students record predictions in their science notebooks. No peer discussion yet — this is individual thinking time.</w:t>
+              <w:t xml:space="preserve">Groups of four receive a set of six colour-coded Evidence Cards spread face-down on their desk. Each card contains: (1) a labelled diagram of the specialised cell, (2) a Kenya-relevant context clue (e.g., 'This cell is found in the blood of a marathon runner from Eldoret — it must carry oxygen to muscles for 42 km'), and (3) a partial function statement with a blank: 'This cell can __________ because its structure includes __________.' The six cells are: RED BLOOD CELL (biconcave disc, no nucleus — Kisumu blood donation context); GUARD CELL (bean-shaped pair, chloroplasts — sukuma wiki shamba context); ROOT HAIR CELL (long hair-like extension — bean seedling germinating in Rift Valley soil context); MUSCLE CELL (elongated, striations, many mitochondria — Kenyan athlete sprinting context); NERVE CELL (long axon, myelin sheath, dendrites — signal from finger to brain after touching a hot sufuria context); SPERM CELL (compact head, midpiece packed with mitochondria, long flagellum — fertilisation context). Groups flip cards one at a time, read them aloud within the group, examine the diagram, and discuss: 'What structural features do you see? What might they be for?' Each student records observations in their notebook using a two-column table: STRUCTURE | POSSIBLE FUNCTION.</w:t>
             </w:r>
           </w:p>
         </w:tc>
@@ -18053,7 +18358,7 @@
                 <w:sz w:val="18"/>
                 <w:szCs w:val="18"/>
               </w:rPr>
-              <w:t xml:space="preserve">Display the two images and read the prompt aloud. Say: 'You have 3 minutes of silent thinking time — no talking, no sharing yet. Write down everything you notice that is DIFFERENT from our generic cell model.' START a visible 3-minute timer. Circulate and observe notebooks — do NOT correct or affirm yet. After 3 minutes, cold-call 4 students (aim for gender balance and at least one student who has been quieter in prior lessons): 'Tell me ONE difference you wrote down — just one.' Record each response verbatim on the board in a column labelled 'Our Predictions.' After all 4 responses, say: 'Hold those predictions — we are going to test every single one of them today using evidence cards. By the end of this lesson you will know whether your prediction was right, partially right, or needs revision.' Do NOT confirm or deny any prediction.</w:t>
+              <w:t xml:space="preserve">Distribute evidence card envelopes before the phase begins. Say: 'You will work as a group of four. Roles today: Card Reader (reads the context clue aloud), Diagram Analyst (describes what they see in the diagram), Recorder (fills in the two-column table for the group), and Devil's Advocate (challenges the group — asks WHY after every suggestion). Rotate roles for each new card.' Allow 12 minutes for group evidence examination. Circulate to every group at least once. Use these specific probing questions when you crouch beside a group: For RBC card — 'If there is no nucleus, what happened to that space? What might fill it instead?' (WAIT 10 seconds before accepting a response.) For guard cell card — 'These cells are in sukuma wiki. What do plants need to let in and out? How might a bean shape help with that?' (WAIT 12 seconds.) For root hair card — 'Imagine you are a water molecule in the soil near a bean seedling in Rift Valley. How does this shape make it easier for the cell to absorb you?' (WAIT 10 seconds.) Cold-call at least 6 different students across all groups during circulations — not just willing volunteers. After 12 minutes, give a 1-minute warning: 'Finish your last card and make sure your Recorder has something written for all six cells.'</w:t>
             </w:r>
           </w:p>
         </w:tc>
@@ -18085,7 +18390,7 @@
                 <w:sz w:val="18"/>
                 <w:szCs w:val="18"/>
               </w:rPr>
-              <w:t xml:space="preserve">Individual Prediction Writing — This strategy activates prior knowledge from Lessons 1–5 (generic cell model) and surfaces student misconceptions before instruction. Recording predictions publicly on the board creates accountability and gives students a personal stake in the evidence-gathering that follows.</w:t>
+              <w:t xml:space="preserve">Evidence Card Analysis with Structured Roles — Assigning rotating roles (Reader, Diagram Analyst, Recorder, Devil's Advocate) ensures all four group members engage with every card rather than one student dominating. The two-column STRUCTURE | POSSIBLE FUNCTION table scaffolds the structure-function reasoning that is the core scientific practice of this lesson (NGSS Science and Engineering Practice 6: Constructing Explanations). The Kenya-relevant context clues (Eldoret marathon runner, Kisumu blood donation, sukuma wiki shamba, bean seedling, hot sufuria) connect abstract cellular biology to lived experience, making the evidence personally meaningful.</w:t>
             </w:r>
           </w:p>
         </w:tc>
@@ -18117,7 +18422,7 @@
                 <w:sz w:val="18"/>
                 <w:szCs w:val="18"/>
               </w:rPr>
-              <w:t xml:space="preserve">Circulate and scan notebooks during the 3-minute silent period. Look for: (a) students who correctly identify absence of nucleus in RBCs, (b) students who notice the chloroplast or vacuole in the leaf cell. Students who write only vague observations ('they look different') will need targeted prompting in Phase 2. Cold-call responses on the board give a quick whole-class snapshot of prior knowledge depth.</w:t>
+              <w:t xml:space="preserve">During circulation, check that the two-column tables contain specific structural vocabulary (e.g., 'no nucleus,' 'elongated,' 'flagellum,' 'many mitochondria') rather than vague terms ('looks weird,' 'has a tail'). Groups that use only vague language need the teacher to model one example: point to the diagram and say, 'What is the NAME of this structure here — do you remember it from our generic cell model?' This links back to Lesson 4 organelle vocabulary. A group is ready for Phase 3 when at least 4 of their 6 rows contain a specific structural feature matched to a plausible function.</w:t>
             </w:r>
           </w:p>
         </w:tc>
@@ -18126,32 +18431,32 @@
         <w:tc>
           <w:tcPr>
             <w:tcW w:type="dxa" w:w="1520"/>
-            <w:shd w:fill="D9EEF1" w:color="auto" w:val="clear"/>
-            <w:tcMar>
-              <w:top w:type="dxa" w:w="60"/>
-              <w:left w:type="dxa" w:w="120"/>
-              <w:bottom w:type="dxa" w:w="60"/>
-              <w:right w:type="dxa" w:w="120"/>
-            </w:tcMar>
-            <w:vAlign w:val="top"/>
-          </w:tcPr>
-          <w:p>
-            <w:pPr>
-              <w:spacing w:after="40" w:before="0"/>
-              <w:jc w:val="left"/>
-            </w:pPr>
-            <w:r>
-              <w:rPr>
-                <w:rFonts w:ascii="Arial" w:cs="Arial" w:eastAsia="Arial" w:hAnsi="Arial"/>
-                <w:b/>
-                <w:bCs/>
-                <w:i w:val="false"/>
-                <w:iCs w:val="false"/>
-                <w:color w:val="000000"/>
-                <w:sz w:val="18"/>
-                <w:szCs w:val="18"/>
-              </w:rPr>
-              <w:t xml:space="preserve">Observe Phase</w:t>
+            <w:shd w:fill="E2EFDA" w:color="auto" w:val="clear"/>
+            <w:tcMar>
+              <w:top w:type="dxa" w:w="60"/>
+              <w:left w:type="dxa" w:w="120"/>
+              <w:bottom w:type="dxa" w:w="60"/>
+              <w:right w:type="dxa" w:w="120"/>
+            </w:tcMar>
+            <w:vAlign w:val="top"/>
+          </w:tcPr>
+          <w:p>
+            <w:pPr>
+              <w:spacing w:after="40" w:before="0"/>
+              <w:jc w:val="left"/>
+            </w:pPr>
+            <w:r>
+              <w:rPr>
+                <w:rFonts w:ascii="Arial" w:cs="Arial" w:eastAsia="Arial" w:hAnsi="Arial"/>
+                <w:b/>
+                <w:bCs/>
+                <w:i w:val="false"/>
+                <w:iCs w:val="false"/>
+                <w:color w:val="000000"/>
+                <w:sz w:val="18"/>
+                <w:szCs w:val="18"/>
+              </w:rPr>
+              <w:t xml:space="preserve">Explain Phase</w:t>
             </w:r>
           </w:p>
           <w:p>
@@ -18174,7 +18479,312 @@
             <w:pPr>
               <w:spacing w:after="20" w:before="0"/>
             </w:pPr>
-            <w:hyperlink w:history="1" r:id="rIdhjuzvwurgkauweppi_-h0">
+            <w:hyperlink w:history="1" r:id="rIdvc6i-ahtctlus7umga87g">
+              <w:r>
+                <w:rPr>
+                  <w:rFonts w:ascii="Arial" w:cs="Arial" w:eastAsia="Arial" w:hAnsi="Arial"/>
+                  <w:color w:val="2E75B6"/>
+                  <w:sz w:val="16"/>
+                  <w:szCs w:val="16"/>
+                  <w:u w:val="single" w:color="2E75B6"/>
+                </w:rPr>
+                <w:t xml:space="preserve">Scientific notation word problem: red blood cells</w:t>
+              </w:r>
+            </w:hyperlink>
+          </w:p>
+          <w:p>
+            <w:pPr>
+              <w:spacing w:after="10" w:before="0"/>
+              <w:ind w:left="120"/>
+            </w:pPr>
+            <w:r>
+              <w:rPr>
+                <w:rFonts w:ascii="Arial" w:cs="Arial" w:eastAsia="Arial" w:hAnsi="Arial"/>
+                <w:color w:val="595959"/>
+                <w:sz w:val="14"/>
+                <w:szCs w:val="14"/>
+              </w:rPr>
+              <w:t xml:space="preserve">Source: Khan Academy (English - US curriculum)</w:t>
+            </w:r>
+          </w:p>
+          <w:p>
+            <w:pPr>
+              <w:spacing w:after="10" w:before="0"/>
+              <w:ind w:left="120"/>
+            </w:pPr>
+            <w:hyperlink w:history="1" r:id="rIdaots54h46ak7cf77ctxpy">
+              <w:r>
+                <w:rPr>
+                  <w:rFonts w:ascii="Arial" w:cs="Arial" w:eastAsia="Arial" w:hAnsi="Arial"/>
+                  <w:color w:val="595959"/>
+                  <w:sz w:val="14"/>
+                  <w:szCs w:val="14"/>
+                  <w:u w:val="single" w:color="595959"/>
+                </w:rPr>
+                <w:t xml:space="preserve">🔍 Search ARES for similar videos</w:t>
+              </w:r>
+            </w:hyperlink>
+          </w:p>
+          <w:p>
+            <w:pPr>
+              <w:spacing w:after="40" w:before="0"/>
+            </w:pPr>
+            <w:r>
+              <w:rPr>
+                <w:sz w:val="14"/>
+                <w:szCs w:val="14"/>
+              </w:rPr>
+              <w:t xml:space="preserve"/>
+            </w:r>
+          </w:p>
+          <w:p>
+            <w:pPr>
+              <w:spacing w:after="20" w:before="0"/>
+            </w:pPr>
+            <w:r>
+              <w:rPr>
+                <w:rFonts w:ascii="Arial" w:cs="Arial" w:eastAsia="Arial" w:hAnsi="Arial"/>
+                <w:b/>
+                <w:bCs/>
+                <w:color w:val="1F3864"/>
+                <w:sz w:val="16"/>
+                <w:szCs w:val="16"/>
+              </w:rPr>
+              <w:t xml:space="preserve">📖 READING:</w:t>
+            </w:r>
+          </w:p>
+          <w:p>
+            <w:pPr>
+              <w:spacing w:after="20" w:before="0"/>
+            </w:pPr>
+            <w:r>
+              <w:rPr>
+                <w:rFonts w:ascii="Arial" w:cs="Arial" w:eastAsia="Arial" w:hAnsi="Arial"/>
+                <w:i/>
+                <w:iCs/>
+                <w:color w:val="595959"/>
+                <w:sz w:val="16"/>
+                <w:szCs w:val="16"/>
+              </w:rPr>
+              <w:t xml:space="preserve">No closely matching reading in the ARES library for this activity.</w:t>
+            </w:r>
+          </w:p>
+          <w:p>
+            <w:pPr>
+              <w:spacing w:after="10" w:before="0"/>
+              <w:ind w:left="120"/>
+            </w:pPr>
+            <w:hyperlink w:history="1" r:id="rId8wedz4gdflhbdeozts_q9">
+              <w:r>
+                <w:rPr>
+                  <w:rFonts w:ascii="Arial" w:cs="Arial" w:eastAsia="Arial" w:hAnsi="Arial"/>
+                  <w:color w:val="595959"/>
+                  <w:sz w:val="14"/>
+                  <w:szCs w:val="14"/>
+                  <w:u w:val="single" w:color="595959"/>
+                </w:rPr>
+                <w:t xml:space="preserve">🔍 Search ARES for readings</w:t>
+              </w:r>
+            </w:hyperlink>
+          </w:p>
+          <w:p>
+            <w:pPr>
+              <w:spacing w:after="10" w:before="0"/>
+              <w:ind w:left="120"/>
+            </w:pPr>
+            <w:r>
+              <w:rPr>
+                <w:rFonts w:ascii="Arial" w:cs="Arial" w:eastAsia="Arial" w:hAnsi="Arial"/>
+                <w:color w:val="595959"/>
+                <w:sz w:val="14"/>
+                <w:szCs w:val="14"/>
+              </w:rPr>
+              <w:t xml:space="preserve">Search terms: cell biology specialisation red</w:t>
+            </w:r>
+          </w:p>
+        </w:tc>
+        <w:tc>
+          <w:tcPr>
+            <w:tcW w:type="dxa" w:w="3040"/>
+            <w:shd w:fill="FFFFFF" w:color="auto" w:val="clear"/>
+            <w:tcMar>
+              <w:top w:type="dxa" w:w="60"/>
+              <w:left w:type="dxa" w:w="120"/>
+              <w:bottom w:type="dxa" w:w="60"/>
+              <w:right w:type="dxa" w:w="120"/>
+            </w:tcMar>
+            <w:vAlign w:val="top"/>
+          </w:tcPr>
+          <w:p>
+            <w:pPr>
+              <w:spacing w:after="40" w:before="0"/>
+              <w:jc w:val="left"/>
+            </w:pPr>
+            <w:r>
+              <w:rPr>
+                <w:rFonts w:ascii="Arial" w:cs="Arial" w:eastAsia="Arial" w:hAnsi="Arial"/>
+                <w:b w:val="false"/>
+                <w:bCs w:val="false"/>
+                <w:i w:val="false"/>
+                <w:iCs w:val="false"/>
+                <w:color w:val="000000"/>
+                <w:sz w:val="18"/>
+                <w:szCs w:val="18"/>
+              </w:rPr>
+              <w:t xml:space="preserve">Part A — CER Share-Out (12 min): Each group selects ONE evidence card to present to the class using the Claim–Evidence–Reasoning (CER) framework written on the board: CLAIM: 'The [cell name] can [function] because…' | EVIDENCE: 'Its structure includes [specific feature], as shown in the diagram by [describe]…' | REASONING: 'This feature helps it function because [scientific explanation]…' Each group has 90 seconds to present. Other groups listen and use a 'Plus/Delta' sticky note: Plus = one thing the presenting group got right; Delta = one thing to add or correct. Part B — Sickle Cell Revisit (8 min): Teacher returns to the anchoring phenomenon. Students are shown three images side by side: a normal biconcave RBC, a sickle-shaped RBC, and a diagram of a blocked blood capillary. Students write a 3-sentence CER explanation in their notebooks answering: 'Why does the sickle shape prevent the red blood cell from doing its job?' Part C — Whole-Class Debrief (5 min): Teacher collects 3 CER responses (cold-called, not volunteered) and reads them aloud. Class votes: 'Does this explanation include a CLAIM? Does it include EVIDENCE from the diagram? Does it include REASONING that links structure to function?' Thumbs up / thumbs sideways / thumbs down for each criterion.</w:t>
+            </w:r>
+          </w:p>
+        </w:tc>
+        <w:tc>
+          <w:tcPr>
+            <w:tcW w:type="dxa" w:w="3040"/>
+            <w:shd w:fill="F2F2F2" w:color="auto" w:val="clear"/>
+            <w:tcMar>
+              <w:top w:type="dxa" w:w="60"/>
+              <w:left w:type="dxa" w:w="120"/>
+              <w:bottom w:type="dxa" w:w="60"/>
+              <w:right w:type="dxa" w:w="120"/>
+            </w:tcMar>
+            <w:vAlign w:val="top"/>
+          </w:tcPr>
+          <w:p>
+            <w:pPr>
+              <w:spacing w:after="40" w:before="0"/>
+              <w:jc w:val="left"/>
+            </w:pPr>
+            <w:r>
+              <w:rPr>
+                <w:rFonts w:ascii="Arial" w:cs="Arial" w:eastAsia="Arial" w:hAnsi="Arial"/>
+                <w:b w:val="false"/>
+                <w:bCs w:val="false"/>
+                <w:i w:val="false"/>
+                <w:iCs w:val="false"/>
+                <w:color w:val="000000"/>
+                <w:sz w:val="18"/>
+                <w:szCs w:val="18"/>
+              </w:rPr>
+              <w:t xml:space="preserve">For Part A: Write the CER scaffold on the board before the phase begins. Say: 'Every group will present ONE card using this exact structure — Claim, Evidence, Reasoning. You have 2 minutes to decide which card and prepare your 90 seconds.' Use a timer visibly. After each group presents, facilitate Plus/Delta: 'Group 2, hold your sticky notes — what is your Plus for Group 1?' Cold-call the Plus from one group and the Delta from a different group. Do NOT editorialize — say: 'Thank you. Group 1, does that Delta change anything about your reasoning?' (WAIT 8 seconds for Group 1 to respond.) Ensure all 6 specialised cells are covered across the 6 groups — if two groups chose the same card, redirect: 'Group 4, Group 2 already took the nerve cell — choose a different one.' For Part B: Project the three sickle-cell images. Say: 'You have studied normal red blood cells. You now see what a sickle cell looks like. Using ONLY what you know about structure and function, write three sentences. Use the words: shape, haemoglobin, oxygen, capillary.' (WAIT — allow 5 minutes of silent individual writing.) For Part C: Do NOT call on raised hands. Say: 'I am going to read three responses — Amina, Brian, and Wanjiru, please hand me your notebooks.' Read each response aloud neutrally. For each, ask the class to evaluate against the three CER criteria using thumbs. After all three, say: 'What would make the STRONGEST version of this explanation? What is missing?' Cold-call 2 students for additions.</w:t>
+            </w:r>
+          </w:p>
+        </w:tc>
+        <w:tc>
+          <w:tcPr>
+            <w:tcW w:type="dxa" w:w="3040"/>
+            <w:shd w:fill="FFFFFF" w:color="auto" w:val="clear"/>
+            <w:tcMar>
+              <w:top w:type="dxa" w:w="60"/>
+              <w:left w:type="dxa" w:w="120"/>
+              <w:bottom w:type="dxa" w:w="60"/>
+              <w:right w:type="dxa" w:w="120"/>
+            </w:tcMar>
+            <w:vAlign w:val="top"/>
+          </w:tcPr>
+          <w:p>
+            <w:pPr>
+              <w:spacing w:after="40" w:before="0"/>
+              <w:jc w:val="left"/>
+            </w:pPr>
+            <w:r>
+              <w:rPr>
+                <w:rFonts w:ascii="Arial" w:cs="Arial" w:eastAsia="Arial" w:hAnsi="Arial"/>
+                <w:b w:val="false"/>
+                <w:bCs w:val="false"/>
+                <w:i w:val="false"/>
+                <w:iCs w:val="false"/>
+                <w:color w:val="000000"/>
+                <w:sz w:val="18"/>
+                <w:szCs w:val="18"/>
+              </w:rPr>
+              <w:t xml:space="preserve">Claim–Evidence–Reasoning (CER) Framework — CER is an explicit argumentation scaffold (NGSS Science and Engineering Practice 7: Engaging in Argument from Evidence) that separates the three components of a scientific explanation. By requiring students to name the specific structural feature as their EVIDENCE and then articulate the mechanistic link as their REASONING, CER prevents the common misconception that correlation equals explanation (e.g., 'it has no nucleus so it carries oxygen' vs. 'the absence of a nucleus creates more internal space, which allows more haemoglobin molecules to pack in, increasing oxygen-carrying capacity'). The sickle-cell revisit is a deliberate transfer task — students must apply the same structure-function logic to an ABNORMAL case, deepening understanding of the norm by examining its disruption.</w:t>
+            </w:r>
+          </w:p>
+        </w:tc>
+        <w:tc>
+          <w:tcPr>
+            <w:tcW w:type="dxa" w:w="3040"/>
+            <w:shd w:fill="F2F2F2" w:color="auto" w:val="clear"/>
+            <w:tcMar>
+              <w:top w:type="dxa" w:w="60"/>
+              <w:left w:type="dxa" w:w="120"/>
+              <w:bottom w:type="dxa" w:w="60"/>
+              <w:right w:type="dxa" w:w="120"/>
+            </w:tcMar>
+            <w:vAlign w:val="top"/>
+          </w:tcPr>
+          <w:p>
+            <w:pPr>
+              <w:spacing w:after="40" w:before="0"/>
+              <w:jc w:val="left"/>
+            </w:pPr>
+            <w:r>
+              <w:rPr>
+                <w:rFonts w:ascii="Arial" w:cs="Arial" w:eastAsia="Arial" w:hAnsi="Arial"/>
+                <w:b w:val="false"/>
+                <w:bCs w:val="false"/>
+                <w:i w:val="false"/>
+                <w:iCs w:val="false"/>
+                <w:color w:val="000000"/>
+                <w:sz w:val="18"/>
+                <w:szCs w:val="18"/>
+              </w:rPr>
+              <w:t xml:space="preserve">Collect 6 Plus/Delta sticky notes after Part A — these reveal whether students can identify correct vs. incomplete structure-function reasoning in peers' explanations. For Part B, use a rapid 4-point rubric during cold-call reading: 1 = claim only, no structure named; 2 = claim + structure named; 3 = claim + structure + function linked; 4 = claim + structure + mechanism explained (e.g., 'sickle shape causes cells to stack and block narrow capillaries, reducing oxygen delivery to tissues'). Students scoring 1–2 need a targeted follow-up question: 'You said the shape causes a problem — what physical thing does the sickle shape do inside a blood vessel?' Students scoring 4 can be invited to add their reasoning to the board as the class model answer.</w:t>
+            </w:r>
+          </w:p>
+        </w:tc>
+      </w:tr>
+      <w:tr>
+        <w:tc>
+          <w:tcPr>
+            <w:tcW w:type="dxa" w:w="1520"/>
+            <w:shd w:fill="FCE4D6" w:color="auto" w:val="clear"/>
+            <w:tcMar>
+              <w:top w:type="dxa" w:w="60"/>
+              <w:left w:type="dxa" w:w="120"/>
+              <w:bottom w:type="dxa" w:w="60"/>
+              <w:right w:type="dxa" w:w="120"/>
+            </w:tcMar>
+            <w:vAlign w:val="top"/>
+          </w:tcPr>
+          <w:p>
+            <w:pPr>
+              <w:spacing w:after="40" w:before="0"/>
+              <w:jc w:val="left"/>
+            </w:pPr>
+            <w:r>
+              <w:rPr>
+                <w:rFonts w:ascii="Arial" w:cs="Arial" w:eastAsia="Arial" w:hAnsi="Arial"/>
+                <w:b/>
+                <w:bCs/>
+                <w:i w:val="false"/>
+                <w:iCs w:val="false"/>
+                <w:color w:val="000000"/>
+                <w:sz w:val="18"/>
+                <w:szCs w:val="18"/>
+              </w:rPr>
+              <w:t xml:space="preserve">Driving Question Board (DQB) Creation</w:t>
+            </w:r>
+          </w:p>
+          <w:p>
+            <w:pPr>
+              <w:spacing w:after="20" w:before="0"/>
+            </w:pPr>
+            <w:r>
+              <w:rPr>
+                <w:rFonts w:ascii="Arial" w:cs="Arial" w:eastAsia="Arial" w:hAnsi="Arial"/>
+                <w:b/>
+                <w:bCs/>
+                <w:color w:val="1F3864"/>
+                <w:sz w:val="16"/>
+                <w:szCs w:val="16"/>
+              </w:rPr>
+              <w:t xml:space="preserve">📹 VIDEO:</w:t>
+            </w:r>
+          </w:p>
+          <w:p>
+            <w:pPr>
+              <w:spacing w:after="20" w:before="0"/>
+            </w:pPr>
+            <w:hyperlink w:history="1" r:id="rIdjbqx5hmdotdqdf7imhdmz">
               <w:r>
                 <w:rPr>
                   <w:rFonts w:ascii="Arial" w:cs="Arial" w:eastAsia="Arial" w:hAnsi="Arial"/>
@@ -18207,7 +18817,7 @@
               <w:spacing w:after="10" w:before="0"/>
               <w:ind w:left="120"/>
             </w:pPr>
-            <w:hyperlink w:history="1" r:id="rIdlep2fxr6ybgu5h1cjvtun">
+            <w:hyperlink w:history="1" r:id="rIdvxbhdju-r5wroyu2w-32z">
               <w:r>
                 <w:rPr>
                   <w:rFonts w:ascii="Arial" w:cs="Arial" w:eastAsia="Arial" w:hAnsi="Arial"/>
@@ -18269,7 +18879,7 @@
               <w:spacing w:after="10" w:before="0"/>
               <w:ind w:left="120"/>
             </w:pPr>
-            <w:hyperlink w:history="1" r:id="rIdlemyn5vwzt5ulsa9_9mmt">
+            <w:hyperlink w:history="1" r:id="rId6tsqo9fkdciyrajvfzihl">
               <w:r>
                 <w:rPr>
                   <w:rFonts w:ascii="Arial" w:cs="Arial" w:eastAsia="Arial" w:hAnsi="Arial"/>
@@ -18326,7 +18936,7 @@
                 <w:sz w:val="18"/>
                 <w:szCs w:val="18"/>
               </w:rPr>
-              <w:t xml:space="preserve">Groups of four receive a set of six colour-coded Evidence Cards spread face-down on their desk. Each card contains: (1) a labelled diagram of the specialised cell, (2) a Kenya-relevant context clue (e.g., 'This cell is found in the blood of a marathon runner from Eldoret — it must carry oxygen to muscles for 42 km'), and (3) a partial function statement with a blank: 'This cell can __________ because its structure includes __________.' The six cells are: RED BLOOD CELL (biconcave disc, no nucleus — Kisumu blood donation context); GUARD CELL (bean-shaped pair, chloroplasts — sukuma wiki shamba context); ROOT HAIR CELL (long hair-like extension — bean seedling germinating in Rift Valley soil context); MUSCLE CELL (elongated, striations, many mitochondria — Kenyan athlete sprinting context); NERVE CELL (long axon, myelin sheath, dendrites — signal from finger to brain after touching a hot sufuria context); SPERM CELL (compact head, midpiece packed with mitochondria, long flagellum — fertilisation context). Groups flip cards one at a time, read them aloud within the group, examine the diagram, and discuss: 'What structural features do you see? What might they be for?' Each student records observations in their notebook using a two-column table: STRUCTURE | POSSIBLE FUNCTION.</w:t>
+              <w:t xml:space="preserve">Students return to the class Driving Question Board (DQB) — a large display that has been accumulating sticky notes, arrows, and model revisions since Lesson 1. Each student receives two sticky notes: one ORANGE ('I can now explain…') and one BLUE ('I still wonder…'). Students write one statement on each. They then approach the DQB and place their notes in the designated columns. The teacher facilitates a 3-minute whole-class gallery walk of the new sticky notes. Students look specifically for: (a) a 'still wonder' question that connects cell specialisation to the next topic (Chemicals of Life / Strand 1.4), and (b) any 'I can now explain' note that directly addresses the original driving question. The class votes on the single most important remaining question to carry forward.</w:t>
             </w:r>
           </w:p>
         </w:tc>
@@ -18358,7 +18968,7 @@
                 <w:sz w:val="18"/>
                 <w:szCs w:val="18"/>
               </w:rPr>
-              <w:t xml:space="preserve">Distribute evidence card envelopes before the phase begins. Say: 'You will work as a group of four. Roles today: Card Reader (reads the context clue aloud), Diagram Analyst (describes what they see in the diagram), Recorder (fills in the two-column table for the group), and Devil's Advocate (challenges the group — asks WHY after every suggestion). Rotate roles for each new card.' Allow 12 minutes for group evidence examination. Circulate to every group at least once. Use these specific probing questions when you crouch beside a group: For RBC card — 'If there is no nucleus, what happened to that space? What might fill it instead?' (WAIT 10 seconds before accepting a response.) For guard cell card — 'These cells are in sukuma wiki. What do plants need to let in and out? How might a bean shape help with that?' (WAIT 12 seconds.) For root hair card — 'Imagine you are a water molecule in the soil near a bean seedling in Rift Valley. How does this shape make it easier for the cell to absorb you?' (WAIT 10 seconds.) Cold-call at least 6 different students across all groups during circulations — not just willing volunteers. After 12 minutes, give a 1-minute warning: 'Finish your last card and make sure your Recorder has something written for all six cells.'</w:t>
+              <w:t xml:space="preserve">Distribute sticky notes and say: 'ORANGE note: complete this sentence — I can now explain [blank] about why cells look different. Be SPECIFIC — name a cell and its feature.' (WAIT 2 minutes of silent writing.) 'BLUE note: What do you still wonder? What does this lesson NOT yet explain about the driving question?' (WAIT 2 minutes.) Direct students to post their notes. During the gallery walk, say: 'Read at least 5 notes that are NOT your own. If you see a BLUE note that matches something you also wonder, put a small tick on it.' After 3 minutes, facilitate a quick vote: 'Which BLUE note asks the most important question we haven't answered yet?' Read the top-voted question aloud and say: 'We will keep this question live on our DQB. In Strand 1.4, when we study the chemicals of life, you may find part of the answer — watch for it.' Write the question on a dedicated 'Carry-Forward' card and pin it prominently.</w:t>
             </w:r>
           </w:p>
         </w:tc>
@@ -18390,7 +19000,7 @@
                 <w:sz w:val="18"/>
                 <w:szCs w:val="18"/>
               </w:rPr>
-              <w:t xml:space="preserve">Evidence Card Analysis with Structured Roles — Assigning rotating roles (Reader, Diagram Analyst, Recorder, Devil's Advocate) ensures all four group members engage with every card rather than one student dominating. The two-column STRUCTURE | POSSIBLE FUNCTION table scaffolds the structure-function reasoning that is the core scientific practice of this lesson (NGSS Science and Engineering Practice 6: Constructing Explanations). The Kenya-relevant context clues (Eldoret marathon runner, Kisumu blood donation, sukuma wiki shamba, bean seedling, hot sufuria) connect abstract cellular biology to lived experience, making the evidence personally meaningful.</w:t>
+              <w:t xml:space="preserve">Driving Question Board (DQB) with Orange/Blue Sticky Notes — The DQB is a visible, cumulative knowledge artefact. The two-colour system distinguishes consolidated understanding (orange) from productive uncertainty (blue). Publicly posting 'still wonder' questions normalises scientific uncertainty as a driver of inquiry rather than a failure of learning. The tick-voting system reveals shared gaps in understanding that the teacher can use to plan Lessons 7–8 and the transition to Strand 1.4. The Carry-Forward question bridges sub-strands, supporting curriculum coherence.</w:t>
             </w:r>
           </w:p>
         </w:tc>
@@ -18422,7 +19032,7 @@
                 <w:sz w:val="18"/>
                 <w:szCs w:val="18"/>
               </w:rPr>
-              <w:t xml:space="preserve">During circulation, check that the two-column tables contain specific structural vocabulary (e.g., 'no nucleus,' 'elongated,' 'flagellum,' 'many mitochondria') rather than vague terms ('looks weird,' 'has a tail'). Groups that use only vague language need the teacher to model one example: point to the diagram and say, 'What is the NAME of this structure here — do you remember it from our generic cell model?' This links back to Lesson 4 organelle vocabulary. A group is ready for Phase 3 when at least 4 of their 6 rows contain a specific structural feature matched to a plausible function.</w:t>
+              <w:t xml:space="preserve">Read all orange sticky notes before Lesson 7. Categorise them: (A) correctly links a specific structural feature to a specific function — these students are ready for Lesson 7 extension; (B) names a cell but does not name the structural feature — these students need a review prompt at the start of Lesson 7; (C) gives only a generic statement ('I can explain cells') — flag these students for a brief 1-on-1 check-in. Count the proportion of blue 'still wonder' notes that ask mechanistic questions ('HOW does…' / 'WHY does…') versus descriptive questions ('WHAT does… look like'). A class with more than 50% mechanistic blue notes is demonstrating strong scientific thinking and is ready for the model-building phase.</w:t>
             </w:r>
           </w:p>
         </w:tc>
@@ -18431,32 +19041,32 @@
         <w:tc>
           <w:tcPr>
             <w:tcW w:type="dxa" w:w="1520"/>
-            <w:shd w:fill="E2EFDA" w:color="auto" w:val="clear"/>
-            <w:tcMar>
-              <w:top w:type="dxa" w:w="60"/>
-              <w:left w:type="dxa" w:w="120"/>
-              <w:bottom w:type="dxa" w:w="60"/>
-              <w:right w:type="dxa" w:w="120"/>
-            </w:tcMar>
-            <w:vAlign w:val="top"/>
-          </w:tcPr>
-          <w:p>
-            <w:pPr>
-              <w:spacing w:after="40" w:before="0"/>
-              <w:jc w:val="left"/>
-            </w:pPr>
-            <w:r>
-              <w:rPr>
-                <w:rFonts w:ascii="Arial" w:cs="Arial" w:eastAsia="Arial" w:hAnsi="Arial"/>
-                <w:b/>
-                <w:bCs/>
-                <w:i w:val="false"/>
-                <w:iCs w:val="false"/>
-                <w:color w:val="000000"/>
-                <w:sz w:val="18"/>
-                <w:szCs w:val="18"/>
-              </w:rPr>
-              <w:t xml:space="preserve">Explain Phase</w:t>
+            <w:shd w:fill="D5E8F0" w:color="auto" w:val="clear"/>
+            <w:tcMar>
+              <w:top w:type="dxa" w:w="60"/>
+              <w:left w:type="dxa" w:w="120"/>
+              <w:bottom w:type="dxa" w:w="60"/>
+              <w:right w:type="dxa" w:w="120"/>
+            </w:tcMar>
+            <w:vAlign w:val="top"/>
+          </w:tcPr>
+          <w:p>
+            <w:pPr>
+              <w:spacing w:after="40" w:before="0"/>
+              <w:jc w:val="left"/>
+            </w:pPr>
+            <w:r>
+              <w:rPr>
+                <w:rFonts w:ascii="Arial" w:cs="Arial" w:eastAsia="Arial" w:hAnsi="Arial"/>
+                <w:b/>
+                <w:bCs/>
+                <w:i w:val="false"/>
+                <w:iCs w:val="false"/>
+                <w:color w:val="000000"/>
+                <w:sz w:val="18"/>
+                <w:szCs w:val="18"/>
+              </w:rPr>
+              <w:t xml:space="preserve">Model Building Phase</w:t>
             </w:r>
           </w:p>
           <w:p>
@@ -18479,7 +19089,7 @@
             <w:pPr>
               <w:spacing w:after="20" w:before="0"/>
             </w:pPr>
-            <w:hyperlink w:history="1" r:id="rIdyrprjqd4b-c5lr0g9vloh">
+            <w:hyperlink w:history="1" r:id="rIdvsignng4xu-nl2lcbcqr8">
               <w:r>
                 <w:rPr>
                   <w:rFonts w:ascii="Arial" w:cs="Arial" w:eastAsia="Arial" w:hAnsi="Arial"/>
@@ -18488,7 +19098,7 @@
                   <w:szCs w:val="16"/>
                   <w:u w:val="single" w:color="2E75B6"/>
                 </w:rPr>
-                <w:t xml:space="preserve">Scientific notation word problem: red blood cells</w:t>
+                <w:t xml:space="preserve">Red blood cells</w:t>
               </w:r>
             </w:hyperlink>
           </w:p>
@@ -18512,7 +19122,7 @@
               <w:spacing w:after="10" w:before="0"/>
               <w:ind w:left="120"/>
             </w:pPr>
-            <w:hyperlink w:history="1" r:id="rIdowwmovui-vsec_z483jpx">
+            <w:hyperlink w:history="1" r:id="rIdefmsmelvd0dlm33xvglht">
               <w:r>
                 <w:rPr>
                   <w:rFonts w:ascii="Arial" w:cs="Arial" w:eastAsia="Arial" w:hAnsi="Arial"/>
@@ -18574,617 +19184,7 @@
               <w:spacing w:after="10" w:before="0"/>
               <w:ind w:left="120"/>
             </w:pPr>
-            <w:hyperlink w:history="1" r:id="rId341zlkdonm3ivhfacng5s">
-              <w:r>
-                <w:rPr>
-                  <w:rFonts w:ascii="Arial" w:cs="Arial" w:eastAsia="Arial" w:hAnsi="Arial"/>
-                  <w:color w:val="595959"/>
-                  <w:sz w:val="14"/>
-                  <w:szCs w:val="14"/>
-                  <w:u w:val="single" w:color="595959"/>
-                </w:rPr>
-                <w:t xml:space="preserve">🔍 Search ARES for readings</w:t>
-              </w:r>
-            </w:hyperlink>
-          </w:p>
-          <w:p>
-            <w:pPr>
-              <w:spacing w:after="10" w:before="0"/>
-              <w:ind w:left="120"/>
-            </w:pPr>
-            <w:r>
-              <w:rPr>
-                <w:rFonts w:ascii="Arial" w:cs="Arial" w:eastAsia="Arial" w:hAnsi="Arial"/>
-                <w:color w:val="595959"/>
-                <w:sz w:val="14"/>
-                <w:szCs w:val="14"/>
-              </w:rPr>
-              <w:t xml:space="preserve">Search terms: cell biology specialisation red</w:t>
-            </w:r>
-          </w:p>
-        </w:tc>
-        <w:tc>
-          <w:tcPr>
-            <w:tcW w:type="dxa" w:w="3040"/>
-            <w:shd w:fill="FFFFFF" w:color="auto" w:val="clear"/>
-            <w:tcMar>
-              <w:top w:type="dxa" w:w="60"/>
-              <w:left w:type="dxa" w:w="120"/>
-              <w:bottom w:type="dxa" w:w="60"/>
-              <w:right w:type="dxa" w:w="120"/>
-            </w:tcMar>
-            <w:vAlign w:val="top"/>
-          </w:tcPr>
-          <w:p>
-            <w:pPr>
-              <w:spacing w:after="40" w:before="0"/>
-              <w:jc w:val="left"/>
-            </w:pPr>
-            <w:r>
-              <w:rPr>
-                <w:rFonts w:ascii="Arial" w:cs="Arial" w:eastAsia="Arial" w:hAnsi="Arial"/>
-                <w:b w:val="false"/>
-                <w:bCs w:val="false"/>
-                <w:i w:val="false"/>
-                <w:iCs w:val="false"/>
-                <w:color w:val="000000"/>
-                <w:sz w:val="18"/>
-                <w:szCs w:val="18"/>
-              </w:rPr>
-              <w:t xml:space="preserve">Part A — CER Share-Out (12 min): Each group selects ONE evidence card to present to the class using the Claim–Evidence–Reasoning (CER) framework written on the board: CLAIM: 'The [cell name] can [function] because…' | EVIDENCE: 'Its structure includes [specific feature], as shown in the diagram by [describe]…' | REASONING: 'This feature helps it function because [scientific explanation]…' Each group has 90 seconds to present. Other groups listen and use a 'Plus/Delta' sticky note: Plus = one thing the presenting group got right; Delta = one thing to add or correct. Part B — Sickle Cell Revisit (8 min): Teacher returns to the anchoring phenomenon. Students are shown three images side by side: a normal biconcave RBC, a sickle-shaped RBC, and a diagram of a blocked blood capillary. Students write a 3-sentence CER explanation in their notebooks answering: 'Why does the sickle shape prevent the red blood cell from doing its job?' Part C — Whole-Class Debrief (5 min): Teacher collects 3 CER responses (cold-called, not volunteered) and reads them aloud. Class votes: 'Does this explanation include a CLAIM? Does it include EVIDENCE from the diagram? Does it include REASONING that links structure to function?' Thumbs up / thumbs sideways / thumbs down for each criterion.</w:t>
-            </w:r>
-          </w:p>
-        </w:tc>
-        <w:tc>
-          <w:tcPr>
-            <w:tcW w:type="dxa" w:w="3040"/>
-            <w:shd w:fill="F2F2F2" w:color="auto" w:val="clear"/>
-            <w:tcMar>
-              <w:top w:type="dxa" w:w="60"/>
-              <w:left w:type="dxa" w:w="120"/>
-              <w:bottom w:type="dxa" w:w="60"/>
-              <w:right w:type="dxa" w:w="120"/>
-            </w:tcMar>
-            <w:vAlign w:val="top"/>
-          </w:tcPr>
-          <w:p>
-            <w:pPr>
-              <w:spacing w:after="40" w:before="0"/>
-              <w:jc w:val="left"/>
-            </w:pPr>
-            <w:r>
-              <w:rPr>
-                <w:rFonts w:ascii="Arial" w:cs="Arial" w:eastAsia="Arial" w:hAnsi="Arial"/>
-                <w:b w:val="false"/>
-                <w:bCs w:val="false"/>
-                <w:i w:val="false"/>
-                <w:iCs w:val="false"/>
-                <w:color w:val="000000"/>
-                <w:sz w:val="18"/>
-                <w:szCs w:val="18"/>
-              </w:rPr>
-              <w:t xml:space="preserve">For Part A: Write the CER scaffold on the board before the phase begins. Say: 'Every group will present ONE card using this exact structure — Claim, Evidence, Reasoning. You have 2 minutes to decide which card and prepare your 90 seconds.' Use a timer visibly. After each group presents, facilitate Plus/Delta: 'Group 2, hold your sticky notes — what is your Plus for Group 1?' Cold-call the Plus from one group and the Delta from a different group. Do NOT editorialize — say: 'Thank you. Group 1, does that Delta change anything about your reasoning?' (WAIT 8 seconds for Group 1 to respond.) Ensure all 6 specialised cells are covered across the 6 groups — if two groups chose the same card, redirect: 'Group 4, Group 2 already took the nerve cell — choose a different one.' For Part B: Project the three sickle-cell images. Say: 'You have studied normal red blood cells. You now see what a sickle cell looks like. Using ONLY what you know about structure and function, write three sentences. Use the words: shape, haemoglobin, oxygen, capillary.' (WAIT — allow 5 minutes of silent individual writing.) For Part C: Do NOT call on raised hands. Say: 'I am going to read three responses — Amina, Brian, and Wanjiru, please hand me your notebooks.' Read each response aloud neutrally. For each, ask the class to evaluate against the three CER criteria using thumbs. After all three, say: 'What would make the STRONGEST version of this explanation? What is missing?' Cold-call 2 students for additions.</w:t>
-            </w:r>
-          </w:p>
-        </w:tc>
-        <w:tc>
-          <w:tcPr>
-            <w:tcW w:type="dxa" w:w="3040"/>
-            <w:shd w:fill="FFFFFF" w:color="auto" w:val="clear"/>
-            <w:tcMar>
-              <w:top w:type="dxa" w:w="60"/>
-              <w:left w:type="dxa" w:w="120"/>
-              <w:bottom w:type="dxa" w:w="60"/>
-              <w:right w:type="dxa" w:w="120"/>
-            </w:tcMar>
-            <w:vAlign w:val="top"/>
-          </w:tcPr>
-          <w:p>
-            <w:pPr>
-              <w:spacing w:after="40" w:before="0"/>
-              <w:jc w:val="left"/>
-            </w:pPr>
-            <w:r>
-              <w:rPr>
-                <w:rFonts w:ascii="Arial" w:cs="Arial" w:eastAsia="Arial" w:hAnsi="Arial"/>
-                <w:b w:val="false"/>
-                <w:bCs w:val="false"/>
-                <w:i w:val="false"/>
-                <w:iCs w:val="false"/>
-                <w:color w:val="000000"/>
-                <w:sz w:val="18"/>
-                <w:szCs w:val="18"/>
-              </w:rPr>
-              <w:t xml:space="preserve">Claim–Evidence–Reasoning (CER) Framework — CER is an explicit argumentation scaffold (NGSS Science and Engineering Practice 7: Engaging in Argument from Evidence) that separates the three components of a scientific explanation. By requiring students to name the specific structural feature as their EVIDENCE and then articulate the mechanistic link as their REASONING, CER prevents the common misconception that correlation equals explanation (e.g., 'it has no nucleus so it carries oxygen' vs. 'the absence of a nucleus creates more internal space, which allows more haemoglobin molecules to pack in, increasing oxygen-carrying capacity'). The sickle-cell revisit is a deliberate transfer task — students must apply the same structure-function logic to an ABNORMAL case, deepening understanding of the norm by examining its disruption.</w:t>
-            </w:r>
-          </w:p>
-        </w:tc>
-        <w:tc>
-          <w:tcPr>
-            <w:tcW w:type="dxa" w:w="3040"/>
-            <w:shd w:fill="F2F2F2" w:color="auto" w:val="clear"/>
-            <w:tcMar>
-              <w:top w:type="dxa" w:w="60"/>
-              <w:left w:type="dxa" w:w="120"/>
-              <w:bottom w:type="dxa" w:w="60"/>
-              <w:right w:type="dxa" w:w="120"/>
-            </w:tcMar>
-            <w:vAlign w:val="top"/>
-          </w:tcPr>
-          <w:p>
-            <w:pPr>
-              <w:spacing w:after="40" w:before="0"/>
-              <w:jc w:val="left"/>
-            </w:pPr>
-            <w:r>
-              <w:rPr>
-                <w:rFonts w:ascii="Arial" w:cs="Arial" w:eastAsia="Arial" w:hAnsi="Arial"/>
-                <w:b w:val="false"/>
-                <w:bCs w:val="false"/>
-                <w:i w:val="false"/>
-                <w:iCs w:val="false"/>
-                <w:color w:val="000000"/>
-                <w:sz w:val="18"/>
-                <w:szCs w:val="18"/>
-              </w:rPr>
-              <w:t xml:space="preserve">Collect 6 Plus/Delta sticky notes after Part A — these reveal whether students can identify correct vs. incomplete structure-function reasoning in peers' explanations. For Part B, use a rapid 4-point rubric during cold-call reading: 1 = claim only, no structure named; 2 = claim + structure named; 3 = claim + structure + function linked; 4 = claim + structure + mechanism explained (e.g., 'sickle shape causes cells to stack and block narrow capillaries, reducing oxygen delivery to tissues'). Students scoring 1–2 need a targeted follow-up question: 'You said the shape causes a problem — what physical thing does the sickle shape do inside a blood vessel?' Students scoring 4 can be invited to add their reasoning to the board as the class model answer.</w:t>
-            </w:r>
-          </w:p>
-        </w:tc>
-      </w:tr>
-      <w:tr>
-        <w:tc>
-          <w:tcPr>
-            <w:tcW w:type="dxa" w:w="1520"/>
-            <w:shd w:fill="FCE4D6" w:color="auto" w:val="clear"/>
-            <w:tcMar>
-              <w:top w:type="dxa" w:w="60"/>
-              <w:left w:type="dxa" w:w="120"/>
-              <w:bottom w:type="dxa" w:w="60"/>
-              <w:right w:type="dxa" w:w="120"/>
-            </w:tcMar>
-            <w:vAlign w:val="top"/>
-          </w:tcPr>
-          <w:p>
-            <w:pPr>
-              <w:spacing w:after="40" w:before="0"/>
-              <w:jc w:val="left"/>
-            </w:pPr>
-            <w:r>
-              <w:rPr>
-                <w:rFonts w:ascii="Arial" w:cs="Arial" w:eastAsia="Arial" w:hAnsi="Arial"/>
-                <w:b/>
-                <w:bCs/>
-                <w:i w:val="false"/>
-                <w:iCs w:val="false"/>
-                <w:color w:val="000000"/>
-                <w:sz w:val="18"/>
-                <w:szCs w:val="18"/>
-              </w:rPr>
-              <w:t xml:space="preserve">Driving Question Board (DQB) Creation</w:t>
-            </w:r>
-          </w:p>
-          <w:p>
-            <w:pPr>
-              <w:spacing w:after="20" w:before="0"/>
-            </w:pPr>
-            <w:r>
-              <w:rPr>
-                <w:rFonts w:ascii="Arial" w:cs="Arial" w:eastAsia="Arial" w:hAnsi="Arial"/>
-                <w:b/>
-                <w:bCs/>
-                <w:color w:val="1F3864"/>
-                <w:sz w:val="16"/>
-                <w:szCs w:val="16"/>
-              </w:rPr>
-              <w:t xml:space="preserve">📹 VIDEO:</w:t>
-            </w:r>
-          </w:p>
-          <w:p>
-            <w:pPr>
-              <w:spacing w:after="20" w:before="0"/>
-            </w:pPr>
-            <w:hyperlink w:history="1" r:id="rId7q3ebg6hax7aq7j5cgbfe">
-              <w:r>
-                <w:rPr>
-                  <w:rFonts w:ascii="Arial" w:cs="Arial" w:eastAsia="Arial" w:hAnsi="Arial"/>
-                  <w:color w:val="2E75B6"/>
-                  <w:sz w:val="16"/>
-                  <w:szCs w:val="16"/>
-                  <w:u w:val="single" w:color="2E75B6"/>
-                </w:rPr>
-                <w:t xml:space="preserve">Red blood cells -dubbed(KY)</w:t>
-              </w:r>
-            </w:hyperlink>
-          </w:p>
-          <w:p>
-            <w:pPr>
-              <w:spacing w:after="10" w:before="0"/>
-              <w:ind w:left="120"/>
-            </w:pPr>
-            <w:r>
-              <w:rPr>
-                <w:rFonts w:ascii="Arial" w:cs="Arial" w:eastAsia="Arial" w:hAnsi="Arial"/>
-                <w:color w:val="595959"/>
-                <w:sz w:val="14"/>
-                <w:szCs w:val="14"/>
-              </w:rPr>
-              <w:t xml:space="preserve">Source: Khan Academy (Kiswahili)</w:t>
-            </w:r>
-          </w:p>
-          <w:p>
-            <w:pPr>
-              <w:spacing w:after="10" w:before="0"/>
-              <w:ind w:left="120"/>
-            </w:pPr>
-            <w:hyperlink w:history="1" r:id="rIdzw-l74kqitrfv4ytoheqq">
-              <w:r>
-                <w:rPr>
-                  <w:rFonts w:ascii="Arial" w:cs="Arial" w:eastAsia="Arial" w:hAnsi="Arial"/>
-                  <w:color w:val="595959"/>
-                  <w:sz w:val="14"/>
-                  <w:szCs w:val="14"/>
-                  <w:u w:val="single" w:color="595959"/>
-                </w:rPr>
-                <w:t xml:space="preserve">🔍 Search ARES for similar videos</w:t>
-              </w:r>
-            </w:hyperlink>
-          </w:p>
-          <w:p>
-            <w:pPr>
-              <w:spacing w:after="40" w:before="0"/>
-            </w:pPr>
-            <w:r>
-              <w:rPr>
-                <w:sz w:val="14"/>
-                <w:szCs w:val="14"/>
-              </w:rPr>
-              <w:t xml:space="preserve"/>
-            </w:r>
-          </w:p>
-          <w:p>
-            <w:pPr>
-              <w:spacing w:after="20" w:before="0"/>
-            </w:pPr>
-            <w:r>
-              <w:rPr>
-                <w:rFonts w:ascii="Arial" w:cs="Arial" w:eastAsia="Arial" w:hAnsi="Arial"/>
-                <w:b/>
-                <w:bCs/>
-                <w:color w:val="1F3864"/>
-                <w:sz w:val="16"/>
-                <w:szCs w:val="16"/>
-              </w:rPr>
-              <w:t xml:space="preserve">📖 READING:</w:t>
-            </w:r>
-          </w:p>
-          <w:p>
-            <w:pPr>
-              <w:spacing w:after="20" w:before="0"/>
-            </w:pPr>
-            <w:r>
-              <w:rPr>
-                <w:rFonts w:ascii="Arial" w:cs="Arial" w:eastAsia="Arial" w:hAnsi="Arial"/>
-                <w:i/>
-                <w:iCs/>
-                <w:color w:val="595959"/>
-                <w:sz w:val="16"/>
-                <w:szCs w:val="16"/>
-              </w:rPr>
-              <w:t xml:space="preserve">No closely matching reading in the ARES library for this activity.</w:t>
-            </w:r>
-          </w:p>
-          <w:p>
-            <w:pPr>
-              <w:spacing w:after="10" w:before="0"/>
-              <w:ind w:left="120"/>
-            </w:pPr>
-            <w:hyperlink w:history="1" r:id="rId_rz3jclrf3mibg4sgmwzm">
-              <w:r>
-                <w:rPr>
-                  <w:rFonts w:ascii="Arial" w:cs="Arial" w:eastAsia="Arial" w:hAnsi="Arial"/>
-                  <w:color w:val="595959"/>
-                  <w:sz w:val="14"/>
-                  <w:szCs w:val="14"/>
-                  <w:u w:val="single" w:color="595959"/>
-                </w:rPr>
-                <w:t xml:space="preserve">🔍 Search ARES for readings</w:t>
-              </w:r>
-            </w:hyperlink>
-          </w:p>
-          <w:p>
-            <w:pPr>
-              <w:spacing w:after="10" w:before="0"/>
-              <w:ind w:left="120"/>
-            </w:pPr>
-            <w:r>
-              <w:rPr>
-                <w:rFonts w:ascii="Arial" w:cs="Arial" w:eastAsia="Arial" w:hAnsi="Arial"/>
-                <w:color w:val="595959"/>
-                <w:sz w:val="14"/>
-                <w:szCs w:val="14"/>
-              </w:rPr>
-              <w:t xml:space="preserve">Search terms: cell biology specialisation red</w:t>
-            </w:r>
-          </w:p>
-        </w:tc>
-        <w:tc>
-          <w:tcPr>
-            <w:tcW w:type="dxa" w:w="3040"/>
-            <w:shd w:fill="FFFFFF" w:color="auto" w:val="clear"/>
-            <w:tcMar>
-              <w:top w:type="dxa" w:w="60"/>
-              <w:left w:type="dxa" w:w="120"/>
-              <w:bottom w:type="dxa" w:w="60"/>
-              <w:right w:type="dxa" w:w="120"/>
-            </w:tcMar>
-            <w:vAlign w:val="top"/>
-          </w:tcPr>
-          <w:p>
-            <w:pPr>
-              <w:spacing w:after="40" w:before="0"/>
-              <w:jc w:val="left"/>
-            </w:pPr>
-            <w:r>
-              <w:rPr>
-                <w:rFonts w:ascii="Arial" w:cs="Arial" w:eastAsia="Arial" w:hAnsi="Arial"/>
-                <w:b w:val="false"/>
-                <w:bCs w:val="false"/>
-                <w:i w:val="false"/>
-                <w:iCs w:val="false"/>
-                <w:color w:val="000000"/>
-                <w:sz w:val="18"/>
-                <w:szCs w:val="18"/>
-              </w:rPr>
-              <w:t xml:space="preserve">Students return to the class Driving Question Board (DQB) — a large display that has been accumulating sticky notes, arrows, and model revisions since Lesson 1. Each student receives two sticky notes: one ORANGE ('I can now explain…') and one BLUE ('I still wonder…'). Students write one statement on each. They then approach the DQB and place their notes in the designated columns. The teacher facilitates a 3-minute whole-class gallery walk of the new sticky notes. Students look specifically for: (a) a 'still wonder' question that connects cell specialisation to the next topic (Chemicals of Life / Strand 1.4), and (b) any 'I can now explain' note that directly addresses the original driving question. The class votes on the single most important remaining question to carry forward.</w:t>
-            </w:r>
-          </w:p>
-        </w:tc>
-        <w:tc>
-          <w:tcPr>
-            <w:tcW w:type="dxa" w:w="3040"/>
-            <w:shd w:fill="F2F2F2" w:color="auto" w:val="clear"/>
-            <w:tcMar>
-              <w:top w:type="dxa" w:w="60"/>
-              <w:left w:type="dxa" w:w="120"/>
-              <w:bottom w:type="dxa" w:w="60"/>
-              <w:right w:type="dxa" w:w="120"/>
-            </w:tcMar>
-            <w:vAlign w:val="top"/>
-          </w:tcPr>
-          <w:p>
-            <w:pPr>
-              <w:spacing w:after="40" w:before="0"/>
-              <w:jc w:val="left"/>
-            </w:pPr>
-            <w:r>
-              <w:rPr>
-                <w:rFonts w:ascii="Arial" w:cs="Arial" w:eastAsia="Arial" w:hAnsi="Arial"/>
-                <w:b w:val="false"/>
-                <w:bCs w:val="false"/>
-                <w:i w:val="false"/>
-                <w:iCs w:val="false"/>
-                <w:color w:val="000000"/>
-                <w:sz w:val="18"/>
-                <w:szCs w:val="18"/>
-              </w:rPr>
-              <w:t xml:space="preserve">Distribute sticky notes and say: 'ORANGE note: complete this sentence — I can now explain [blank] about why cells look different. Be SPECIFIC — name a cell and its feature.' (WAIT 2 minutes of silent writing.) 'BLUE note: What do you still wonder? What does this lesson NOT yet explain about the driving question?' (WAIT 2 minutes.) Direct students to post their notes. During the gallery walk, say: 'Read at least 5 notes that are NOT your own. If you see a BLUE note that matches something you also wonder, put a small tick on it.' After 3 minutes, facilitate a quick vote: 'Which BLUE note asks the most important question we haven't answered yet?' Read the top-voted question aloud and say: 'We will keep this question live on our DQB. In Strand 1.4, when we study the chemicals of life, you may find part of the answer — watch for it.' Write the question on a dedicated 'Carry-Forward' card and pin it prominently.</w:t>
-            </w:r>
-          </w:p>
-        </w:tc>
-        <w:tc>
-          <w:tcPr>
-            <w:tcW w:type="dxa" w:w="3040"/>
-            <w:shd w:fill="FFFFFF" w:color="auto" w:val="clear"/>
-            <w:tcMar>
-              <w:top w:type="dxa" w:w="60"/>
-              <w:left w:type="dxa" w:w="120"/>
-              <w:bottom w:type="dxa" w:w="60"/>
-              <w:right w:type="dxa" w:w="120"/>
-            </w:tcMar>
-            <w:vAlign w:val="top"/>
-          </w:tcPr>
-          <w:p>
-            <w:pPr>
-              <w:spacing w:after="40" w:before="0"/>
-              <w:jc w:val="left"/>
-            </w:pPr>
-            <w:r>
-              <w:rPr>
-                <w:rFonts w:ascii="Arial" w:cs="Arial" w:eastAsia="Arial" w:hAnsi="Arial"/>
-                <w:b w:val="false"/>
-                <w:bCs w:val="false"/>
-                <w:i w:val="false"/>
-                <w:iCs w:val="false"/>
-                <w:color w:val="000000"/>
-                <w:sz w:val="18"/>
-                <w:szCs w:val="18"/>
-              </w:rPr>
-              <w:t xml:space="preserve">Driving Question Board (DQB) with Orange/Blue Sticky Notes — The DQB is a visible, cumulative knowledge artefact. The two-colour system distinguishes consolidated understanding (orange) from productive uncertainty (blue). Publicly posting 'still wonder' questions normalises scientific uncertainty as a driver of inquiry rather than a failure of learning. The tick-voting system reveals shared gaps in understanding that the teacher can use to plan Lessons 7–8 and the transition to Strand 1.4. The Carry-Forward question bridges sub-strands, supporting curriculum coherence.</w:t>
-            </w:r>
-          </w:p>
-        </w:tc>
-        <w:tc>
-          <w:tcPr>
-            <w:tcW w:type="dxa" w:w="3040"/>
-            <w:shd w:fill="F2F2F2" w:color="auto" w:val="clear"/>
-            <w:tcMar>
-              <w:top w:type="dxa" w:w="60"/>
-              <w:left w:type="dxa" w:w="120"/>
-              <w:bottom w:type="dxa" w:w="60"/>
-              <w:right w:type="dxa" w:w="120"/>
-            </w:tcMar>
-            <w:vAlign w:val="top"/>
-          </w:tcPr>
-          <w:p>
-            <w:pPr>
-              <w:spacing w:after="40" w:before="0"/>
-              <w:jc w:val="left"/>
-            </w:pPr>
-            <w:r>
-              <w:rPr>
-                <w:rFonts w:ascii="Arial" w:cs="Arial" w:eastAsia="Arial" w:hAnsi="Arial"/>
-                <w:b w:val="false"/>
-                <w:bCs w:val="false"/>
-                <w:i w:val="false"/>
-                <w:iCs w:val="false"/>
-                <w:color w:val="000000"/>
-                <w:sz w:val="18"/>
-                <w:szCs w:val="18"/>
-              </w:rPr>
-              <w:t xml:space="preserve">Read all orange sticky notes before Lesson 7. Categorise them: (A) correctly links a specific structural feature to a specific function — these students are ready for Lesson 7 extension; (B) names a cell but does not name the structural feature — these students need a review prompt at the start of Lesson 7; (C) gives only a generic statement ('I can explain cells') — flag these students for a brief 1-on-1 check-in. Count the proportion of blue 'still wonder' notes that ask mechanistic questions ('HOW does…' / 'WHY does…') versus descriptive questions ('WHAT does… look like'). A class with more than 50% mechanistic blue notes is demonstrating strong scientific thinking and is ready for the model-building phase.</w:t>
-            </w:r>
-          </w:p>
-        </w:tc>
-      </w:tr>
-      <w:tr>
-        <w:tc>
-          <w:tcPr>
-            <w:tcW w:type="dxa" w:w="1520"/>
-            <w:shd w:fill="D5E8F0" w:color="auto" w:val="clear"/>
-            <w:tcMar>
-              <w:top w:type="dxa" w:w="60"/>
-              <w:left w:type="dxa" w:w="120"/>
-              <w:bottom w:type="dxa" w:w="60"/>
-              <w:right w:type="dxa" w:w="120"/>
-            </w:tcMar>
-            <w:vAlign w:val="top"/>
-          </w:tcPr>
-          <w:p>
-            <w:pPr>
-              <w:spacing w:after="40" w:before="0"/>
-              <w:jc w:val="left"/>
-            </w:pPr>
-            <w:r>
-              <w:rPr>
-                <w:rFonts w:ascii="Arial" w:cs="Arial" w:eastAsia="Arial" w:hAnsi="Arial"/>
-                <w:b/>
-                <w:bCs/>
-                <w:i w:val="false"/>
-                <w:iCs w:val="false"/>
-                <w:color w:val="000000"/>
-                <w:sz w:val="18"/>
-                <w:szCs w:val="18"/>
-              </w:rPr>
-              <w:t xml:space="preserve">Model Building Phase</w:t>
-            </w:r>
-          </w:p>
-          <w:p>
-            <w:pPr>
-              <w:spacing w:after="20" w:before="0"/>
-            </w:pPr>
-            <w:r>
-              <w:rPr>
-                <w:rFonts w:ascii="Arial" w:cs="Arial" w:eastAsia="Arial" w:hAnsi="Arial"/>
-                <w:b/>
-                <w:bCs/>
-                <w:color w:val="1F3864"/>
-                <w:sz w:val="16"/>
-                <w:szCs w:val="16"/>
-              </w:rPr>
-              <w:t xml:space="preserve">📹 VIDEO:</w:t>
-            </w:r>
-          </w:p>
-          <w:p>
-            <w:pPr>
-              <w:spacing w:after="20" w:before="0"/>
-            </w:pPr>
-            <w:hyperlink w:history="1" r:id="rIdcr51sa7obpvdva_p5cpf0">
-              <w:r>
-                <w:rPr>
-                  <w:rFonts w:ascii="Arial" w:cs="Arial" w:eastAsia="Arial" w:hAnsi="Arial"/>
-                  <w:color w:val="2E75B6"/>
-                  <w:sz w:val="16"/>
-                  <w:szCs w:val="16"/>
-                  <w:u w:val="single" w:color="2E75B6"/>
-                </w:rPr>
-                <w:t xml:space="preserve">Red blood cells -dubbed(KY)</w:t>
-              </w:r>
-            </w:hyperlink>
-          </w:p>
-          <w:p>
-            <w:pPr>
-              <w:spacing w:after="10" w:before="0"/>
-              <w:ind w:left="120"/>
-            </w:pPr>
-            <w:r>
-              <w:rPr>
-                <w:rFonts w:ascii="Arial" w:cs="Arial" w:eastAsia="Arial" w:hAnsi="Arial"/>
-                <w:color w:val="595959"/>
-                <w:sz w:val="14"/>
-                <w:szCs w:val="14"/>
-              </w:rPr>
-              <w:t xml:space="preserve">Source: Khan Academy (Kiswahili)</w:t>
-            </w:r>
-          </w:p>
-          <w:p>
-            <w:pPr>
-              <w:spacing w:after="10" w:before="0"/>
-              <w:ind w:left="120"/>
-            </w:pPr>
-            <w:hyperlink w:history="1" r:id="rId7pcv81x6fej_7evecilgr">
-              <w:r>
-                <w:rPr>
-                  <w:rFonts w:ascii="Arial" w:cs="Arial" w:eastAsia="Arial" w:hAnsi="Arial"/>
-                  <w:color w:val="595959"/>
-                  <w:sz w:val="14"/>
-                  <w:szCs w:val="14"/>
-                  <w:u w:val="single" w:color="595959"/>
-                </w:rPr>
-                <w:t xml:space="preserve">🔍 Search ARES for similar videos</w:t>
-              </w:r>
-            </w:hyperlink>
-          </w:p>
-          <w:p>
-            <w:pPr>
-              <w:spacing w:after="40" w:before="0"/>
-            </w:pPr>
-            <w:r>
-              <w:rPr>
-                <w:sz w:val="14"/>
-                <w:szCs w:val="14"/>
-              </w:rPr>
-              <w:t xml:space="preserve"/>
-            </w:r>
-          </w:p>
-          <w:p>
-            <w:pPr>
-              <w:spacing w:after="20" w:before="0"/>
-            </w:pPr>
-            <w:r>
-              <w:rPr>
-                <w:rFonts w:ascii="Arial" w:cs="Arial" w:eastAsia="Arial" w:hAnsi="Arial"/>
-                <w:b/>
-                <w:bCs/>
-                <w:color w:val="1F3864"/>
-                <w:sz w:val="16"/>
-                <w:szCs w:val="16"/>
-              </w:rPr>
-              <w:t xml:space="preserve">📖 READING:</w:t>
-            </w:r>
-          </w:p>
-          <w:p>
-            <w:pPr>
-              <w:spacing w:after="20" w:before="0"/>
-            </w:pPr>
-            <w:r>
-              <w:rPr>
-                <w:rFonts w:ascii="Arial" w:cs="Arial" w:eastAsia="Arial" w:hAnsi="Arial"/>
-                <w:i/>
-                <w:iCs/>
-                <w:color w:val="595959"/>
-                <w:sz w:val="16"/>
-                <w:szCs w:val="16"/>
-              </w:rPr>
-              <w:t xml:space="preserve">No closely matching reading in the ARES library for this activity.</w:t>
-            </w:r>
-          </w:p>
-          <w:p>
-            <w:pPr>
-              <w:spacing w:after="10" w:before="0"/>
-              <w:ind w:left="120"/>
-            </w:pPr>
-            <w:hyperlink w:history="1" r:id="rIdxpet5shygiemwtrwyhcnv">
+            <w:hyperlink w:history="1" r:id="rIdsgddz5zqth-ukwm_-npzz">
               <w:r>
                 <w:rPr>
                   <w:rFonts w:ascii="Arial" w:cs="Arial" w:eastAsia="Arial" w:hAnsi="Arial"/>
@@ -20876,7 +20876,7 @@
             <w:pPr>
               <w:spacing w:after="20" w:before="0"/>
             </w:pPr>
-            <w:hyperlink w:history="1" r:id="rIdgjsqsnwgeqh18j9u01edo">
+            <w:hyperlink w:history="1" r:id="rId1uxb8gnzycatsfi94isaz">
               <w:r>
                 <w:rPr>
                   <w:rFonts w:ascii="Arial" w:cs="Arial" w:eastAsia="Arial" w:hAnsi="Arial"/>
@@ -20909,7 +20909,7 @@
               <w:spacing w:after="10" w:before="0"/>
               <w:ind w:left="120"/>
             </w:pPr>
-            <w:hyperlink w:history="1" r:id="rIdfuukaujegiayb2rz4pgdc">
+            <w:hyperlink w:history="1" r:id="rIdxqoxqykvj9bnkqfvw3zxl">
               <w:r>
                 <w:rPr>
                   <w:rFonts w:ascii="Arial" w:cs="Arial" w:eastAsia="Arial" w:hAnsi="Arial"/>
@@ -20954,7 +20954,7 @@
             <w:pPr>
               <w:spacing w:after="20" w:before="0"/>
             </w:pPr>
-            <w:hyperlink w:history="1" r:id="rIdc6xucdcqhh4iftha-wshl">
+            <w:hyperlink w:history="1" r:id="rIdf59n85bkremthd5jhunw3">
               <w:r>
                 <w:rPr>
                   <w:rFonts w:ascii="Arial" w:cs="Arial" w:eastAsia="Arial" w:hAnsi="Arial"/>
@@ -20987,7 +20987,7 @@
               <w:spacing w:after="10" w:before="0"/>
               <w:ind w:left="120"/>
             </w:pPr>
-            <w:hyperlink w:history="1" r:id="rIdhlxbu0o1sqzj60vgjs55z">
+            <w:hyperlink w:history="1" r:id="rId3sllicpusus4gjk7fr9m4">
               <w:r>
                 <w:rPr>
                   <w:rFonts w:ascii="Arial" w:cs="Arial" w:eastAsia="Arial" w:hAnsi="Arial"/>
@@ -21182,7 +21182,7 @@
             <w:pPr>
               <w:spacing w:after="20" w:before="0"/>
             </w:pPr>
-            <w:hyperlink w:history="1" r:id="rIdfrvz6ivil1qh1sqfvxbre">
+            <w:hyperlink w:history="1" r:id="rId72vnpjwagpmwtmnmkrfcb">
               <w:r>
                 <w:rPr>
                   <w:rFonts w:ascii="Arial" w:cs="Arial" w:eastAsia="Arial" w:hAnsi="Arial"/>
@@ -21215,7 +21215,7 @@
               <w:spacing w:after="10" w:before="0"/>
               <w:ind w:left="120"/>
             </w:pPr>
-            <w:hyperlink w:history="1" r:id="rIdc8ygomsfkhxj36_l2sllo">
+            <w:hyperlink w:history="1" r:id="rIdb88kbade6zeuv0rd4gtg1">
               <w:r>
                 <w:rPr>
                   <w:rFonts w:ascii="Arial" w:cs="Arial" w:eastAsia="Arial" w:hAnsi="Arial"/>
@@ -21260,7 +21260,7 @@
             <w:pPr>
               <w:spacing w:after="20" w:before="0"/>
             </w:pPr>
-            <w:hyperlink w:history="1" r:id="rIdvlulkafhgbyvk5mj9q16f">
+            <w:hyperlink w:history="1" r:id="rIdqz4u1pdqt8nvr8usb1-6v">
               <w:r>
                 <w:rPr>
                   <w:rFonts w:ascii="Arial" w:cs="Arial" w:eastAsia="Arial" w:hAnsi="Arial"/>
@@ -21293,7 +21293,7 @@
               <w:spacing w:after="10" w:before="0"/>
               <w:ind w:left="120"/>
             </w:pPr>
-            <w:hyperlink w:history="1" r:id="rId51kd_-_zir3jrqhf13dxt">
+            <w:hyperlink w:history="1" r:id="rIdnzgmmvaqs5zcfoay70_sm">
               <w:r>
                 <w:rPr>
                   <w:rFonts w:ascii="Arial" w:cs="Arial" w:eastAsia="Arial" w:hAnsi="Arial"/>
@@ -21488,7 +21488,7 @@
             <w:pPr>
               <w:spacing w:after="20" w:before="0"/>
             </w:pPr>
-            <w:hyperlink w:history="1" r:id="rIdqvpvm2koffq9lo3x_xy1j">
+            <w:hyperlink w:history="1" r:id="rIdtb4uoguaqj4jjphvqvsoy">
               <w:r>
                 <w:rPr>
                   <w:rFonts w:ascii="Arial" w:cs="Arial" w:eastAsia="Arial" w:hAnsi="Arial"/>
@@ -21521,7 +21521,7 @@
               <w:spacing w:after="10" w:before="0"/>
               <w:ind w:left="120"/>
             </w:pPr>
-            <w:hyperlink w:history="1" r:id="rIdgrdqvpi1js2jqauzrtkg2">
+            <w:hyperlink w:history="1" r:id="rIdgvsk9zvit0xu0wwskigs5">
               <w:r>
                 <w:rPr>
                   <w:rFonts w:ascii="Arial" w:cs="Arial" w:eastAsia="Arial" w:hAnsi="Arial"/>
@@ -21566,7 +21566,7 @@
             <w:pPr>
               <w:spacing w:after="20" w:before="0"/>
             </w:pPr>
-            <w:hyperlink w:history="1" r:id="rIdglzxvuw5dfe0rbqhz0fjc">
+            <w:hyperlink w:history="1" r:id="rIduozkrwrrfi1nilvkqoaat">
               <w:r>
                 <w:rPr>
                   <w:rFonts w:ascii="Arial" w:cs="Arial" w:eastAsia="Arial" w:hAnsi="Arial"/>
@@ -21599,7 +21599,7 @@
               <w:spacing w:after="10" w:before="0"/>
               <w:ind w:left="120"/>
             </w:pPr>
-            <w:hyperlink w:history="1" r:id="rIdfneh_g8joqkjttstmowbw">
+            <w:hyperlink w:history="1" r:id="rIdeq-ramsscgpfphr-srfiw">
               <w:r>
                 <w:rPr>
                   <w:rFonts w:ascii="Arial" w:cs="Arial" w:eastAsia="Arial" w:hAnsi="Arial"/>
@@ -21794,7 +21794,7 @@
             <w:pPr>
               <w:spacing w:after="20" w:before="0"/>
             </w:pPr>
-            <w:hyperlink w:history="1" r:id="rIdkzv-li9g10gpvx1axa7oy">
+            <w:hyperlink w:history="1" r:id="rIdu1vfgg0thgwjwmegz4ape">
               <w:r>
                 <w:rPr>
                   <w:rFonts w:ascii="Arial" w:cs="Arial" w:eastAsia="Arial" w:hAnsi="Arial"/>
@@ -21827,7 +21827,7 @@
               <w:spacing w:after="10" w:before="0"/>
               <w:ind w:left="120"/>
             </w:pPr>
-            <w:hyperlink w:history="1" r:id="rIda8emdr3xmptwf-av9bmhj">
+            <w:hyperlink w:history="1" r:id="rIdcbm-osy7ccmqoocg5eclk">
               <w:r>
                 <w:rPr>
                   <w:rFonts w:ascii="Arial" w:cs="Arial" w:eastAsia="Arial" w:hAnsi="Arial"/>
@@ -21872,7 +21872,7 @@
             <w:pPr>
               <w:spacing w:after="20" w:before="0"/>
             </w:pPr>
-            <w:hyperlink w:history="1" r:id="rIdvm-fku7k_rc3srnuzwgba">
+            <w:hyperlink w:history="1" r:id="rIdxpdq3xezcmtcgwmkjmdmi">
               <w:r>
                 <w:rPr>
                   <w:rFonts w:ascii="Arial" w:cs="Arial" w:eastAsia="Arial" w:hAnsi="Arial"/>
@@ -21905,7 +21905,7 @@
               <w:spacing w:after="10" w:before="0"/>
               <w:ind w:left="120"/>
             </w:pPr>
-            <w:hyperlink w:history="1" r:id="rId3hu20ucw8wfpicsidcfjv">
+            <w:hyperlink w:history="1" r:id="rId0nwq52e7ws8qzctd-ucwn">
               <w:r>
                 <w:rPr>
                   <w:rFonts w:ascii="Arial" w:cs="Arial" w:eastAsia="Arial" w:hAnsi="Arial"/>
@@ -22100,7 +22100,7 @@
             <w:pPr>
               <w:spacing w:after="20" w:before="0"/>
             </w:pPr>
-            <w:hyperlink w:history="1" r:id="rIdxsjyu-xvv844635oepxd3">
+            <w:hyperlink w:history="1" r:id="rIddejfyqotkc9ief1teqjxs">
               <w:r>
                 <w:rPr>
                   <w:rFonts w:ascii="Arial" w:cs="Arial" w:eastAsia="Arial" w:hAnsi="Arial"/>
@@ -22133,7 +22133,7 @@
               <w:spacing w:after="10" w:before="0"/>
               <w:ind w:left="120"/>
             </w:pPr>
-            <w:hyperlink w:history="1" r:id="rIdvcr6w0xee1zpgmdmd584i">
+            <w:hyperlink w:history="1" r:id="rId_3k1_spr-tmabmczsh5e7">
               <w:r>
                 <w:rPr>
                   <w:rFonts w:ascii="Arial" w:cs="Arial" w:eastAsia="Arial" w:hAnsi="Arial"/>
@@ -22178,7 +22178,7 @@
             <w:pPr>
               <w:spacing w:after="20" w:before="0"/>
             </w:pPr>
-            <w:hyperlink w:history="1" r:id="rIdvtykgbbtibzalrusbtnct">
+            <w:hyperlink w:history="1" r:id="rIdchzcusb3cuqze-uspsmzq">
               <w:r>
                 <w:rPr>
                   <w:rFonts w:ascii="Arial" w:cs="Arial" w:eastAsia="Arial" w:hAnsi="Arial"/>
@@ -22211,7 +22211,7 @@
               <w:spacing w:after="10" w:before="0"/>
               <w:ind w:left="120"/>
             </w:pPr>
-            <w:hyperlink w:history="1" r:id="rIdhx4mofpoi2vyfhbc694jm">
+            <w:hyperlink w:history="1" r:id="rIdza-jggkwzkm4jmtoiel84">
               <w:r>
                 <w:rPr>
                   <w:rFonts w:ascii="Arial" w:cs="Arial" w:eastAsia="Arial" w:hAnsi="Arial"/>
@@ -23964,7 +23964,7 @@
             <w:pPr>
               <w:spacing w:after="20" w:before="0"/>
             </w:pPr>
-            <w:hyperlink w:history="1" r:id="rId9fi4xsvgsj8uylzs5b8d4">
+            <w:hyperlink w:history="1" r:id="rIdr1gparwarn2k5kfmesjlu">
               <w:r>
                 <w:rPr>
                   <w:rFonts w:ascii="Arial" w:cs="Arial" w:eastAsia="Arial" w:hAnsi="Arial"/>
@@ -23997,7 +23997,7 @@
               <w:spacing w:after="10" w:before="0"/>
               <w:ind w:left="120"/>
             </w:pPr>
-            <w:hyperlink w:history="1" r:id="rIdp9yc8_yyvz0aiymjrhbh_">
+            <w:hyperlink w:history="1" r:id="rIdqkpsurmbusepbcag2tklm">
               <w:r>
                 <w:rPr>
                   <w:rFonts w:ascii="Arial" w:cs="Arial" w:eastAsia="Arial" w:hAnsi="Arial"/>
@@ -24042,7 +24042,7 @@
             <w:pPr>
               <w:spacing w:after="20" w:before="0"/>
             </w:pPr>
-            <w:hyperlink w:history="1" r:id="rIdhlu8u6nsws7hnwalqd7te">
+            <w:hyperlink w:history="1" r:id="rIdxpiy0dj8tnmvdzwj1oi07">
               <w:r>
                 <w:rPr>
                   <w:rFonts w:ascii="Arial" w:cs="Arial" w:eastAsia="Arial" w:hAnsi="Arial"/>
@@ -24075,7 +24075,7 @@
               <w:spacing w:after="10" w:before="0"/>
               <w:ind w:left="120"/>
             </w:pPr>
-            <w:hyperlink w:history="1" r:id="rIdvu49qjhfwugy-_bzegsvx">
+            <w:hyperlink w:history="1" r:id="rIdpr5jhwqdwrbhcm9w5cqzu">
               <w:r>
                 <w:rPr>
                   <w:rFonts w:ascii="Arial" w:cs="Arial" w:eastAsia="Arial" w:hAnsi="Arial"/>
@@ -24270,7 +24270,7 @@
             <w:pPr>
               <w:spacing w:after="20" w:before="0"/>
             </w:pPr>
-            <w:hyperlink w:history="1" r:id="rIdl6mnmp5bfkuzseadof9i4">
+            <w:hyperlink w:history="1" r:id="rId5xwxpm9x8v9eaqn1erejq">
               <w:r>
                 <w:rPr>
                   <w:rFonts w:ascii="Arial" w:cs="Arial" w:eastAsia="Arial" w:hAnsi="Arial"/>
@@ -24303,7 +24303,7 @@
               <w:spacing w:after="10" w:before="0"/>
               <w:ind w:left="120"/>
             </w:pPr>
-            <w:hyperlink w:history="1" r:id="rId204dz2nbfkyrv5yrc0dqm">
+            <w:hyperlink w:history="1" r:id="rIduavvx__yrbe0jowvqkaas">
               <w:r>
                 <w:rPr>
                   <w:rFonts w:ascii="Arial" w:cs="Arial" w:eastAsia="Arial" w:hAnsi="Arial"/>
@@ -24348,7 +24348,7 @@
             <w:pPr>
               <w:spacing w:after="20" w:before="0"/>
             </w:pPr>
-            <w:hyperlink w:history="1" r:id="rIdd85hzk5chrw51dvrldlak">
+            <w:hyperlink w:history="1" r:id="rIdart8dbo7ne2klhclpnfzv">
               <w:r>
                 <w:rPr>
                   <w:rFonts w:ascii="Arial" w:cs="Arial" w:eastAsia="Arial" w:hAnsi="Arial"/>
@@ -24381,7 +24381,7 @@
               <w:spacing w:after="10" w:before="0"/>
               <w:ind w:left="120"/>
             </w:pPr>
-            <w:hyperlink w:history="1" r:id="rIdx7vzkbsqm3vve2uuqayvv">
+            <w:hyperlink w:history="1" r:id="rIdzklyjtfr72knbyjbrrzyg">
               <w:r>
                 <w:rPr>
                   <w:rFonts w:ascii="Arial" w:cs="Arial" w:eastAsia="Arial" w:hAnsi="Arial"/>
@@ -24576,7 +24576,7 @@
             <w:pPr>
               <w:spacing w:after="20" w:before="0"/>
             </w:pPr>
-            <w:hyperlink w:history="1" r:id="rIdu4vqtjjppsszr_z4lxhsb">
+            <w:hyperlink w:history="1" r:id="rIdu2qnlklnny31q6esamrdu">
               <w:r>
                 <w:rPr>
                   <w:rFonts w:ascii="Arial" w:cs="Arial" w:eastAsia="Arial" w:hAnsi="Arial"/>
@@ -24609,7 +24609,7 @@
               <w:spacing w:after="10" w:before="0"/>
               <w:ind w:left="120"/>
             </w:pPr>
-            <w:hyperlink w:history="1" r:id="rIdtbrifrabwzp7wkewxo7ni">
+            <w:hyperlink w:history="1" r:id="rId8mqdue6s9knpku60ig6gg">
               <w:r>
                 <w:rPr>
                   <w:rFonts w:ascii="Arial" w:cs="Arial" w:eastAsia="Arial" w:hAnsi="Arial"/>
@@ -24654,7 +24654,7 @@
             <w:pPr>
               <w:spacing w:after="20" w:before="0"/>
             </w:pPr>
-            <w:hyperlink w:history="1" r:id="rIdgwx1ciullao-kgmlc_mu3">
+            <w:hyperlink w:history="1" r:id="rIdwndu7pbrz7tlve0wf9ay_">
               <w:r>
                 <w:rPr>
                   <w:rFonts w:ascii="Arial" w:cs="Arial" w:eastAsia="Arial" w:hAnsi="Arial"/>
@@ -24687,7 +24687,7 @@
               <w:spacing w:after="10" w:before="0"/>
               <w:ind w:left="120"/>
             </w:pPr>
-            <w:hyperlink w:history="1" r:id="rId82c9v2uvz_tntwqw6zwo4">
+            <w:hyperlink w:history="1" r:id="rIdhxt_lquv1rcs63yw205eh">
               <w:r>
                 <w:rPr>
                   <w:rFonts w:ascii="Arial" w:cs="Arial" w:eastAsia="Arial" w:hAnsi="Arial"/>
@@ -24882,7 +24882,7 @@
             <w:pPr>
               <w:spacing w:after="20" w:before="0"/>
             </w:pPr>
-            <w:hyperlink w:history="1" r:id="rIdox2ajvccz6kjpmt-d9g4r">
+            <w:hyperlink w:history="1" r:id="rIdxzuvndbbewqalhg75usgl">
               <w:r>
                 <w:rPr>
                   <w:rFonts w:ascii="Arial" w:cs="Arial" w:eastAsia="Arial" w:hAnsi="Arial"/>
@@ -24915,7 +24915,7 @@
               <w:spacing w:after="10" w:before="0"/>
               <w:ind w:left="120"/>
             </w:pPr>
-            <w:hyperlink w:history="1" r:id="rIdwnmwusu_gzvutsods5iat">
+            <w:hyperlink w:history="1" r:id="rId3wm1kwf8txqjnixncbr6p">
               <w:r>
                 <w:rPr>
                   <w:rFonts w:ascii="Arial" w:cs="Arial" w:eastAsia="Arial" w:hAnsi="Arial"/>
@@ -24960,7 +24960,7 @@
             <w:pPr>
               <w:spacing w:after="20" w:before="0"/>
             </w:pPr>
-            <w:hyperlink w:history="1" r:id="rIdszjdonupfc-iibqn1jnkd">
+            <w:hyperlink w:history="1" r:id="rIdzc1cbamtsbaq9ii79im2f">
               <w:r>
                 <w:rPr>
                   <w:rFonts w:ascii="Arial" w:cs="Arial" w:eastAsia="Arial" w:hAnsi="Arial"/>
@@ -24993,7 +24993,7 @@
               <w:spacing w:after="10" w:before="0"/>
               <w:ind w:left="120"/>
             </w:pPr>
-            <w:hyperlink w:history="1" r:id="rIdjsdnovzrnm9bpqt_9ijk2">
+            <w:hyperlink w:history="1" r:id="rId4goy94bxxpeefl33incwk">
               <w:r>
                 <w:rPr>
                   <w:rFonts w:ascii="Arial" w:cs="Arial" w:eastAsia="Arial" w:hAnsi="Arial"/>
@@ -25188,7 +25188,7 @@
             <w:pPr>
               <w:spacing w:after="20" w:before="0"/>
             </w:pPr>
-            <w:hyperlink w:history="1" r:id="rId15shav4bf4hmgdksrxrug">
+            <w:hyperlink w:history="1" r:id="rIdyzk02yu8dbypzn0uijpyw">
               <w:r>
                 <w:rPr>
                   <w:rFonts w:ascii="Arial" w:cs="Arial" w:eastAsia="Arial" w:hAnsi="Arial"/>
@@ -25221,7 +25221,7 @@
               <w:spacing w:after="10" w:before="0"/>
               <w:ind w:left="120"/>
             </w:pPr>
-            <w:hyperlink w:history="1" r:id="rIdrgi14pvsx6p6yiwe5vzth">
+            <w:hyperlink w:history="1" r:id="rId8oyfmqnep_u9i-wfa_ual">
               <w:r>
                 <w:rPr>
                   <w:rFonts w:ascii="Arial" w:cs="Arial" w:eastAsia="Arial" w:hAnsi="Arial"/>
@@ -25266,7 +25266,7 @@
             <w:pPr>
               <w:spacing w:after="20" w:before="0"/>
             </w:pPr>
-            <w:hyperlink w:history="1" r:id="rId842stpvjbrcsurrzrev2e">
+            <w:hyperlink w:history="1" r:id="rId4cuvhzgxralq_zw7ia4o5">
               <w:r>
                 <w:rPr>
                   <w:rFonts w:ascii="Arial" w:cs="Arial" w:eastAsia="Arial" w:hAnsi="Arial"/>
@@ -25299,7 +25299,7 @@
               <w:spacing w:after="10" w:before="0"/>
               <w:ind w:left="120"/>
             </w:pPr>
-            <w:hyperlink w:history="1" r:id="rIdedegp3nokmyet-k3_nfh_">
+            <w:hyperlink w:history="1" r:id="rId6uvsrwipg3qznjrhdaggs">
               <w:r>
                 <w:rPr>
                   <w:rFonts w:ascii="Arial" w:cs="Arial" w:eastAsia="Arial" w:hAnsi="Arial"/>

</xml_diff>